<commit_message>
fix: refactor lesson plan format to standard Heading 2 hierarchy and eliminate legacy big table in SKILL.md
</commit_message>
<xml_diff>
--- a/examples/四年级上/第10课_从数据到编码/10_从数据到编码_教案.docx
+++ b/examples/四年级上/第10课_从数据到编码/10_从数据到编码_教案.docx
@@ -2,7 +2,7 @@
 <file path=word/document.xml><?xml version="1.0" encoding="utf-8"?>
 <w:document xmlns:w="http://schemas.openxmlformats.org/wordprocessingml/2006/main" xmlns:m="http://schemas.openxmlformats.org/officeDocument/2006/math" xmlns:r="http://schemas.openxmlformats.org/officeDocument/2006/relationships" xmlns:o="urn:schemas-microsoft-com:office:office" xmlns:v="urn:schemas-microsoft-com:vml" xmlns:w10="urn:schemas-microsoft-com:office:word" xmlns:a="http://schemas.openxmlformats.org/drawingml/2006/main" xmlns:pic="http://schemas.openxmlformats.org/drawingml/2006/picture" xmlns:wp="http://schemas.openxmlformats.org/drawingml/2006/wordprocessingDrawing">
   <w:body>
-    <w:bookmarkStart w:id="9" w:name="_93f7b8b0bc16dbb7e771afd04b2e54e4b4fb090"/>
+    <w:bookmarkStart w:id="20" w:name="_93f7b8b0bc16dbb7e771afd04b2e54e4b4fb090"/>
     <w:p>
       <w:pPr>
         <w:pStyle w:val="1"/>
@@ -61,8 +61,10 @@
         </w:tblCellMar>
       </w:tblPr>
       <w:tblGrid>
-        <w:gridCol w:w="713"/>
-        <w:gridCol w:w="7206"/>
+        <w:gridCol w:w="1072"/>
+        <w:gridCol w:w="2887"/>
+        <w:gridCol w:w="1072"/>
+        <w:gridCol w:w="2887"/>
       </w:tblGrid>
       <w:tr>
         <w:trPr>
@@ -84,10 +86,9 @@
               <w:rPr>
                 <w:rFonts w:hint="eastAsia" w:ascii="黑体" w:hAnsi="黑体" w:eastAsia="黑体"/>
                 <w:b/>
-                <w:bCs/>
                 <w:sz w:val="21"/>
               </w:rPr>
-              <w:t xml:space="preserve">学科</w:t>
+              <w:t xml:space="preserve">课题</w:t>
             </w:r>
           </w:p>
         </w:tc>
@@ -108,7 +109,66 @@
                 <w:b/>
                 <w:sz w:val="21"/>
               </w:rPr>
-              <w:t xml:space="preserve">信息科技</w:t>
+              <w:t xml:space="preserve">第10课</w:t>
+            </w:r>
+            <w:r>
+              <w:rPr>
+                <w:rFonts w:ascii="黑体" w:hAnsi="黑体" w:eastAsia="黑体"/>
+                <w:b/>
+                <w:sz w:val="21"/>
+              </w:rPr>
+              <w:t xml:space="preserve"> </w:t>
+            </w:r>
+            <w:r>
+              <w:rPr>
+                <w:rFonts w:hint="eastAsia" w:ascii="黑体" w:hAnsi="黑体" w:eastAsia="黑体"/>
+                <w:b/>
+                <w:sz w:val="21"/>
+              </w:rPr>
+              <w:t xml:space="preserve">从数据到编码</w:t>
+            </w:r>
+          </w:p>
+        </w:tc>
+        <w:tc>
+          <w:tcPr>
+            <w:vAlign w:val="center"/>
+            <w:shd w:fill="F2F4F7"/>
+          </w:tcPr>
+          <w:p>
+            <w:pPr>
+              <w:pStyle w:val="Compact"/>
+              <w:spacing w:before="20" w:after="20" w:line="300" w:lineRule="auto"/>
+              <w:ind w:firstLine="0"/>
+              <w:jc w:val="left"/>
+            </w:pPr>
+            <w:r>
+              <w:rPr>
+                <w:rFonts w:hint="eastAsia" w:ascii="黑体" w:hAnsi="黑体" w:eastAsia="黑体"/>
+                <w:b/>
+                <w:sz w:val="21"/>
+              </w:rPr>
+              <w:t xml:space="preserve">教材版本</w:t>
+            </w:r>
+          </w:p>
+        </w:tc>
+        <w:tc>
+          <w:tcPr>
+            <w:vAlign w:val="center"/>
+          </w:tcPr>
+          <w:p>
+            <w:pPr>
+              <w:pStyle w:val="Compact"/>
+              <w:spacing w:before="20" w:after="20" w:line="300" w:lineRule="auto"/>
+              <w:ind w:firstLine="0"/>
+              <w:jc w:val="left"/>
+            </w:pPr>
+            <w:r>
+              <w:rPr>
+                <w:rFonts w:hint="eastAsia" w:ascii="黑体" w:hAnsi="黑体" w:eastAsia="黑体"/>
+                <w:b/>
+                <w:sz w:val="21"/>
+              </w:rPr>
+              <w:t xml:space="preserve">浙教版2026</w:t>
             </w:r>
           </w:p>
         </w:tc>
@@ -133,7 +193,7 @@
                 <w:bCs/>
                 <w:sz w:val="21"/>
               </w:rPr>
-              <w:t xml:space="preserve">课题</w:t>
+              <w:t xml:space="preserve">单元</w:t>
             </w:r>
           </w:p>
         </w:tc>
@@ -153,7 +213,7 @@
                 <w:rFonts w:hint="eastAsia" w:ascii="宋体" w:hAnsi="宋体" w:eastAsia="宋体"/>
                 <w:sz w:val="21"/>
               </w:rPr>
-              <w:t xml:space="preserve">第10课</w:t>
+              <w:t xml:space="preserve">第三单元</w:t>
             </w:r>
             <w:r>
               <w:rPr>
@@ -167,12 +227,10 @@
                 <w:rFonts w:hint="eastAsia" w:ascii="宋体" w:hAnsi="宋体" w:eastAsia="宋体"/>
                 <w:sz w:val="21"/>
               </w:rPr>
-              <w:t xml:space="preserve">从数据到编码</w:t>
+              <w:t xml:space="preserve">身边的编码</w:t>
             </w:r>
           </w:p>
         </w:tc>
-      </w:tr>
-      <w:tr>
         <w:tc>
           <w:tcPr>
             <w:vAlign w:val="center"/>
@@ -192,7 +250,7 @@
                 <w:bCs/>
                 <w:sz w:val="21"/>
               </w:rPr>
-              <w:t xml:space="preserve">单元</w:t>
+              <w:t xml:space="preserve">授课年级</w:t>
             </w:r>
           </w:p>
         </w:tc>
@@ -212,493 +270,426 @@
                 <w:rFonts w:hint="eastAsia" w:ascii="宋体" w:hAnsi="宋体" w:eastAsia="宋体"/>
                 <w:sz w:val="21"/>
               </w:rPr>
-              <w:t xml:space="preserve">第三单元</w:t>
+              <w:t xml:space="preserve">小学四年级上册</w:t>
             </w:r>
             <w:r>
               <w:rPr>
                 <w:rFonts w:ascii="宋体" w:hAnsi="宋体" w:eastAsia="宋体"/>
                 <w:sz w:val="21"/>
               </w:rPr>
-              <w:t xml:space="preserve"> </w:t>
+              <w:t xml:space="preserve"> · </w:t>
             </w:r>
             <w:r>
               <w:rPr>
                 <w:rFonts w:hint="eastAsia" w:ascii="宋体" w:hAnsi="宋体" w:eastAsia="宋体"/>
                 <w:sz w:val="21"/>
               </w:rPr>
-              <w:t xml:space="preserve">身边的编码</w:t>
-            </w:r>
-          </w:p>
-        </w:tc>
-      </w:tr>
-      <w:tr>
-        <w:tc>
-          <w:tcPr>
-            <w:vAlign w:val="center"/>
-            <w:shd w:fill="F2F4F7"/>
-          </w:tcPr>
-          <w:p>
-            <w:pPr>
-              <w:pStyle w:val="Compact"/>
-              <w:spacing w:before="20" w:after="20" w:line="300" w:lineRule="auto"/>
-              <w:ind w:firstLine="0"/>
-              <w:jc w:val="left"/>
-            </w:pPr>
-            <w:r>
-              <w:rPr>
-                <w:rFonts w:hint="eastAsia" w:ascii="黑体" w:hAnsi="黑体" w:eastAsia="黑体"/>
-                <w:b/>
-                <w:bCs/>
-                <w:sz w:val="21"/>
-              </w:rPr>
-              <w:t xml:space="preserve">年级</w:t>
-            </w:r>
-          </w:p>
-        </w:tc>
-        <w:tc>
-          <w:tcPr>
-            <w:vAlign w:val="center"/>
-          </w:tcPr>
-          <w:p>
-            <w:pPr>
-              <w:pStyle w:val="Compact"/>
-              <w:spacing w:before="20" w:after="20" w:line="300" w:lineRule="auto"/>
-              <w:ind w:firstLine="0"/>
-              <w:jc w:val="left"/>
-            </w:pPr>
-            <w:r>
-              <w:rPr>
-                <w:rFonts w:hint="eastAsia" w:ascii="宋体" w:hAnsi="宋体" w:eastAsia="宋体"/>
-                <w:sz w:val="21"/>
-              </w:rPr>
-              <w:t xml:space="preserve">四年级上册</w:t>
-            </w:r>
-          </w:p>
-        </w:tc>
-      </w:tr>
-      <w:tr>
-        <w:tc>
-          <w:tcPr>
-            <w:vAlign w:val="center"/>
-            <w:shd w:fill="F2F4F7"/>
-          </w:tcPr>
-          <w:p>
-            <w:pPr>
-              <w:pStyle w:val="Compact"/>
-              <w:spacing w:before="20" w:after="20" w:line="300" w:lineRule="auto"/>
-              <w:ind w:firstLine="0"/>
-              <w:jc w:val="left"/>
-            </w:pPr>
-            <w:r>
-              <w:rPr>
-                <w:rFonts w:hint="eastAsia" w:ascii="黑体" w:hAnsi="黑体" w:eastAsia="黑体"/>
-                <w:b/>
-                <w:bCs/>
-                <w:sz w:val="21"/>
-              </w:rPr>
-              <w:t xml:space="preserve">教材分析</w:t>
-            </w:r>
-          </w:p>
-        </w:tc>
-        <w:tc>
-          <w:tcPr>
-            <w:vAlign w:val="center"/>
-          </w:tcPr>
-          <w:p>
-            <w:pPr>
-              <w:pStyle w:val="Compact"/>
-              <w:spacing w:before="20" w:after="20" w:line="300" w:lineRule="auto"/>
-              <w:ind w:firstLine="0"/>
-              <w:jc w:val="left"/>
-            </w:pPr>
-            <w:r>
-              <w:rPr>
-                <w:rFonts w:hint="eastAsia" w:ascii="宋体" w:hAnsi="宋体" w:eastAsia="宋体"/>
-                <w:sz w:val="21"/>
-              </w:rPr>
-              <w:t xml:space="preserve">本课是浙江教育版小学信息科技四年级上册第三单元《身边的编码》第10课。教材依托课本第40~43页，从学生学号表切入，引导学生理解散乱数据如何通过规则生成编码；列举门牌号、班牌、牛耳牌等生活实例，阐明编码保持社会秩序的科学基础；进而归纳数字、图形（条形码）、经纬度等呈现方式；最后拓展地铁车门混合编码与超市条码练习，为后续编码探究奠定基础。</w:t>
-            </w:r>
-          </w:p>
-        </w:tc>
-      </w:tr>
-      <w:tr>
-        <w:tc>
-          <w:tcPr>
-            <w:vAlign w:val="center"/>
-            <w:shd w:fill="F2F4F7"/>
-          </w:tcPr>
-          <w:p>
-            <w:pPr>
-              <w:pStyle w:val="Compact"/>
-              <w:spacing w:before="20" w:after="20" w:line="300" w:lineRule="auto"/>
-              <w:ind w:firstLine="0"/>
-              <w:jc w:val="left"/>
-            </w:pPr>
-            <w:r>
-              <w:rPr>
-                <w:rFonts w:hint="eastAsia" w:ascii="黑体" w:hAnsi="黑体" w:eastAsia="黑体"/>
-                <w:b/>
-                <w:bCs/>
-                <w:sz w:val="21"/>
-              </w:rPr>
-              <w:t xml:space="preserve">学情分析</w:t>
-            </w:r>
-          </w:p>
-        </w:tc>
-        <w:tc>
-          <w:tcPr>
-            <w:vAlign w:val="center"/>
-          </w:tcPr>
-          <w:p>
-            <w:pPr>
-              <w:pStyle w:val="Compact"/>
-              <w:spacing w:before="20" w:after="20" w:line="300" w:lineRule="auto"/>
-              <w:ind w:firstLine="0"/>
-              <w:jc w:val="left"/>
-            </w:pPr>
-            <w:r>
-              <w:rPr>
-                <w:rFonts w:hint="eastAsia" w:ascii="宋体" w:hAnsi="宋体" w:eastAsia="宋体"/>
-                <w:sz w:val="21"/>
-              </w:rPr>
-              <w:t xml:space="preserve">四年级学生在生活中接触过学号、门牌、条形码等编码，但多停留在表面认读，缺乏对“编码规则”与“唯一标识”的理解。易出现将数据直接拼凑、忽略统一位数（如班级未补零导致长短不一）等卡点。教学中需结合生活比喻降低认知坡度，通过启发设问和避坑指导，引导学生领会编码的秩序价值。</w:t>
-            </w:r>
-          </w:p>
-        </w:tc>
-      </w:tr>
-      <w:tr>
-        <w:tc>
-          <w:tcPr>
-            <w:vAlign w:val="center"/>
-            <w:shd w:fill="F2F4F7"/>
-          </w:tcPr>
-          <w:p>
-            <w:pPr>
-              <w:pStyle w:val="Compact"/>
-              <w:spacing w:before="20" w:after="20" w:line="300" w:lineRule="auto"/>
-              <w:ind w:firstLine="0"/>
-              <w:jc w:val="left"/>
-            </w:pPr>
-            <w:r>
-              <w:rPr>
-                <w:rFonts w:hint="eastAsia" w:ascii="黑体" w:hAnsi="黑体" w:eastAsia="黑体"/>
-                <w:b/>
-                <w:bCs/>
-                <w:sz w:val="21"/>
-              </w:rPr>
-              <w:t xml:space="preserve">核心素养</w:t>
-            </w:r>
-          </w:p>
-        </w:tc>
-        <w:tc>
-          <w:tcPr>
-            <w:vAlign w:val="center"/>
-          </w:tcPr>
-          <w:p>
-            <w:pPr>
-              <w:pStyle w:val="Compact"/>
-              <w:spacing w:before="20" w:after="20" w:line="300" w:lineRule="auto"/>
-              <w:ind w:firstLine="0"/>
-              <w:jc w:val="left"/>
-            </w:pPr>
-            <w:r>
-              <w:rPr>
-                <w:rFonts w:ascii="宋体" w:hAnsi="宋体" w:eastAsia="宋体"/>
-                <w:sz w:val="21"/>
-              </w:rPr>
-              <w:t xml:space="preserve">1.</w:t>
-            </w:r>
-            <w:r>
-              <w:rPr>
-                <w:rFonts w:ascii="宋体" w:hAnsi="宋体" w:eastAsia="宋体"/>
-                <w:sz w:val="21"/>
-              </w:rPr>
-              <w:t xml:space="preserve"> </w:t>
-            </w:r>
-            <w:r>
-              <w:rPr>
-                <w:rFonts w:hint="eastAsia" w:ascii="宋体" w:hAnsi="宋体" w:eastAsia="宋体"/>
-                <w:b/>
-                <w:bCs/>
-                <w:sz w:val="21"/>
-              </w:rPr>
-              <w:t xml:space="preserve">信息意识</w:t>
-            </w:r>
-            <w:r>
-              <w:rPr>
-                <w:rFonts w:hint="eastAsia" w:ascii="宋体" w:hAnsi="宋体" w:eastAsia="宋体"/>
-                <w:sz w:val="21"/>
-              </w:rPr>
-              <w:t xml:space="preserve">：感知身边广泛存在的编码，认识手机号、条形码等均为规范数据，体会编码是事物的“唯一数字身份证”，树立保护个人编码隐私的安全意识。</w:t>
-            </w:r>
-            <w:r>
-              <w:rPr>
-                <w:rFonts w:ascii="宋体" w:hAnsi="宋体" w:eastAsia="宋体"/>
-                <w:sz w:val="21"/>
-              </w:rPr>
-              <w:br/>
-            </w:r>
-            <w:r>
-              <w:rPr>
-                <w:rFonts w:ascii="宋体" w:hAnsi="宋体" w:eastAsia="宋体"/>
-                <w:sz w:val="21"/>
-              </w:rPr>
-              <w:t xml:space="preserve">2.</w:t>
-            </w:r>
-            <w:r>
-              <w:rPr>
-                <w:rFonts w:ascii="宋体" w:hAnsi="宋体" w:eastAsia="宋体"/>
-                <w:sz w:val="21"/>
-              </w:rPr>
-              <w:t xml:space="preserve"> </w:t>
-            </w:r>
-            <w:r>
-              <w:rPr>
-                <w:rFonts w:hint="eastAsia" w:ascii="宋体" w:hAnsi="宋体" w:eastAsia="宋体"/>
-                <w:b/>
-                <w:bCs/>
-                <w:sz w:val="21"/>
-              </w:rPr>
-              <w:t xml:space="preserve">计算思维</w:t>
-            </w:r>
-            <w:r>
-              <w:rPr>
-                <w:rFonts w:hint="eastAsia" w:ascii="宋体" w:hAnsi="宋体" w:eastAsia="宋体"/>
-                <w:sz w:val="21"/>
-              </w:rPr>
-              <w:t xml:space="preserve">：经历从生活数据到编码规则的抽象过程，分析字符段与属性的映射关系，初步萌发规则编排思维。</w:t>
-            </w:r>
-            <w:r>
-              <w:rPr>
-                <w:rFonts w:ascii="宋体" w:hAnsi="宋体" w:eastAsia="宋体"/>
-                <w:sz w:val="21"/>
-              </w:rPr>
-              <w:br/>
-            </w:r>
-            <w:r>
-              <w:rPr>
-                <w:rFonts w:ascii="宋体" w:hAnsi="宋体" w:eastAsia="宋体"/>
-                <w:sz w:val="21"/>
-              </w:rPr>
-              <w:t xml:space="preserve">3.</w:t>
-            </w:r>
-            <w:r>
-              <w:rPr>
-                <w:rFonts w:ascii="宋体" w:hAnsi="宋体" w:eastAsia="宋体"/>
-                <w:sz w:val="21"/>
-              </w:rPr>
-              <w:t xml:space="preserve"> </w:t>
-            </w:r>
-            <w:r>
-              <w:rPr>
-                <w:rFonts w:hint="eastAsia" w:ascii="宋体" w:hAnsi="宋体" w:eastAsia="宋体"/>
-                <w:b/>
-                <w:bCs/>
-                <w:sz w:val="21"/>
-              </w:rPr>
-              <w:t xml:space="preserve">数字化学习与创新</w:t>
-            </w:r>
-            <w:r>
-              <w:rPr>
-                <w:rFonts w:hint="eastAsia" w:ascii="宋体" w:hAnsi="宋体" w:eastAsia="宋体"/>
-                <w:sz w:val="21"/>
-              </w:rPr>
-              <w:t xml:space="preserve">：利用机房互动课件开展速配与微型车门破译仿真，在数字探究中提升协同学习能力。</w:t>
-            </w:r>
-            <w:r>
-              <w:rPr>
-                <w:rFonts w:ascii="宋体" w:hAnsi="宋体" w:eastAsia="宋体"/>
-                <w:sz w:val="21"/>
-              </w:rPr>
-              <w:br/>
-            </w:r>
-            <w:r>
-              <w:rPr>
-                <w:rFonts w:ascii="宋体" w:hAnsi="宋体" w:eastAsia="宋体"/>
-                <w:sz w:val="21"/>
-              </w:rPr>
-              <w:t xml:space="preserve">4.</w:t>
-            </w:r>
-            <w:r>
-              <w:rPr>
-                <w:rFonts w:ascii="宋体" w:hAnsi="宋体" w:eastAsia="宋体"/>
-                <w:sz w:val="21"/>
-              </w:rPr>
-              <w:t xml:space="preserve"> </w:t>
-            </w:r>
-            <w:r>
-              <w:rPr>
-                <w:rFonts w:hint="eastAsia" w:ascii="宋体" w:hAnsi="宋体" w:eastAsia="宋体"/>
-                <w:b/>
-                <w:bCs/>
-                <w:sz w:val="21"/>
-              </w:rPr>
-              <w:t xml:space="preserve">信息社会责任</w:t>
-            </w:r>
-            <w:r>
-              <w:rPr>
-                <w:rFonts w:hint="eastAsia" w:ascii="宋体" w:hAnsi="宋体" w:eastAsia="宋体"/>
-                <w:sz w:val="21"/>
-              </w:rPr>
-              <w:t xml:space="preserve">：理解规范编码是保障社会高效运转的基础，自觉遵守数字化系统的编码规范。</w:t>
-            </w:r>
-          </w:p>
-        </w:tc>
-      </w:tr>
-      <w:tr>
-        <w:tc>
-          <w:tcPr>
-            <w:vAlign w:val="center"/>
-            <w:shd w:fill="F2F4F7"/>
-          </w:tcPr>
-          <w:p>
-            <w:pPr>
-              <w:pStyle w:val="Compact"/>
-              <w:spacing w:before="20" w:after="20" w:line="300" w:lineRule="auto"/>
-              <w:ind w:firstLine="0"/>
-              <w:jc w:val="left"/>
-            </w:pPr>
-            <w:r>
-              <w:rPr>
-                <w:rFonts w:hint="eastAsia" w:ascii="黑体" w:hAnsi="黑体" w:eastAsia="黑体"/>
-                <w:b/>
-                <w:bCs/>
-                <w:sz w:val="21"/>
-              </w:rPr>
-              <w:t xml:space="preserve">重点</w:t>
-            </w:r>
-          </w:p>
-        </w:tc>
-        <w:tc>
-          <w:tcPr>
-            <w:vAlign w:val="center"/>
-          </w:tcPr>
-          <w:p>
-            <w:pPr>
-              <w:pStyle w:val="Compact"/>
-              <w:spacing w:before="20" w:after="20" w:line="300" w:lineRule="auto"/>
-              <w:ind w:firstLine="0"/>
-              <w:jc w:val="left"/>
-            </w:pPr>
-            <w:r>
-              <w:rPr>
-                <w:rFonts w:ascii="宋体" w:hAnsi="宋体" w:eastAsia="宋体"/>
-                <w:sz w:val="21"/>
-              </w:rPr>
-              <w:t xml:space="preserve">1. </w:t>
-            </w:r>
-            <w:r>
-              <w:rPr>
-                <w:rFonts w:hint="eastAsia" w:ascii="宋体" w:hAnsi="宋体" w:eastAsia="宋体"/>
-                <w:sz w:val="21"/>
-              </w:rPr>
-              <w:t xml:space="preserve">理解数据与编码的关系，认识编码是按约定规则进行的规范性描述，具有唯一标识和规范秩序的作用。</w:t>
-            </w:r>
-            <w:r>
-              <w:rPr>
-                <w:rFonts w:ascii="宋体" w:hAnsi="宋体" w:eastAsia="宋体"/>
-                <w:sz w:val="21"/>
-              </w:rPr>
-              <w:br/>
-            </w:r>
-            <w:r>
-              <w:rPr>
-                <w:rFonts w:ascii="宋体" w:hAnsi="宋体" w:eastAsia="宋体"/>
-                <w:sz w:val="21"/>
-              </w:rPr>
-              <w:t xml:space="preserve">2. </w:t>
-            </w:r>
-            <w:r>
-              <w:rPr>
-                <w:rFonts w:hint="eastAsia" w:ascii="宋体" w:hAnsi="宋体" w:eastAsia="宋体"/>
-                <w:sz w:val="21"/>
-              </w:rPr>
-              <w:t xml:space="preserve">掌握编码的多种呈现方式（数字、图形条码、经纬度及混合编码），能准确解释典型编码的字段含义。</w:t>
-            </w:r>
-          </w:p>
-        </w:tc>
-      </w:tr>
-      <w:tr>
-        <w:tc>
-          <w:tcPr>
-            <w:vAlign w:val="center"/>
-            <w:shd w:fill="F2F4F7"/>
-          </w:tcPr>
-          <w:p>
-            <w:pPr>
-              <w:pStyle w:val="Compact"/>
-              <w:spacing w:before="20" w:after="20" w:line="300" w:lineRule="auto"/>
-              <w:ind w:firstLine="0"/>
-              <w:jc w:val="left"/>
-            </w:pPr>
-            <w:r>
-              <w:rPr>
-                <w:rFonts w:hint="eastAsia" w:ascii="黑体" w:hAnsi="黑体" w:eastAsia="黑体"/>
-                <w:b/>
-                <w:bCs/>
-                <w:sz w:val="21"/>
-              </w:rPr>
-              <w:t xml:space="preserve">难点</w:t>
-            </w:r>
-          </w:p>
-        </w:tc>
-        <w:tc>
-          <w:tcPr>
-            <w:vAlign w:val="center"/>
-          </w:tcPr>
-          <w:p>
-            <w:pPr>
-              <w:pStyle w:val="Compact"/>
-              <w:spacing w:before="20" w:after="20" w:line="300" w:lineRule="auto"/>
-              <w:ind w:firstLine="0"/>
-              <w:jc w:val="left"/>
-            </w:pPr>
-            <w:r>
-              <w:rPr>
-                <w:rFonts w:ascii="宋体" w:hAnsi="宋体" w:eastAsia="宋体"/>
-                <w:sz w:val="21"/>
-              </w:rPr>
-              <w:t xml:space="preserve">1. </w:t>
-            </w:r>
-            <w:r>
-              <w:rPr>
-                <w:rFonts w:hint="eastAsia" w:ascii="宋体" w:hAnsi="宋体" w:eastAsia="宋体"/>
-                <w:sz w:val="21"/>
-              </w:rPr>
-              <w:t xml:space="preserve">理解分散数据如何通过约定规则整合成具有确定逻辑意义的规范编码。</w:t>
-            </w:r>
-            <w:r>
-              <w:rPr>
-                <w:rFonts w:ascii="宋体" w:hAnsi="宋体" w:eastAsia="宋体"/>
-                <w:sz w:val="21"/>
-              </w:rPr>
-              <w:br/>
-            </w:r>
-            <w:r>
-              <w:rPr>
-                <w:rFonts w:ascii="宋体" w:hAnsi="宋体" w:eastAsia="宋体"/>
-                <w:sz w:val="21"/>
-              </w:rPr>
-              <w:t xml:space="preserve">2. </w:t>
-            </w:r>
-            <w:r>
-              <w:rPr>
-                <w:rFonts w:hint="eastAsia" w:ascii="宋体" w:hAnsi="宋体" w:eastAsia="宋体"/>
-                <w:sz w:val="21"/>
-              </w:rPr>
-              <w:t xml:space="preserve">结合具体场景（如地铁车门检修）破译混合编码各字段的映射逻辑。</w:t>
+              <w:t xml:space="preserve">1课时</w:t>
             </w:r>
           </w:p>
         </w:tc>
       </w:tr>
     </w:tbl>
+    <w:bookmarkStart w:id="9" w:name="_一教材分析"/>
     <w:p>
       <w:pPr>
+        <w:pStyle w:val="2"/>
+        <w:spacing w:before="200" w:after="80" w:line="312" w:lineRule="auto"/>
+        <w:ind w:firstLine="0"/>
+        <w:jc w:val="left"/>
+      </w:pPr>
+      <w:r>
+        <w:rPr>
+          <w:rFonts w:hint="eastAsia" w:ascii="黑体" w:hAnsi="黑体" w:eastAsia="黑体"/>
+          <w:b/>
+          <w:color w:val="2E1F5E"/>
+          <w:sz w:val="26"/>
+        </w:rPr>
+        <w:t xml:space="preserve">一、教材分析</w:t>
+      </w:r>
+    </w:p>
+    <w:p>
+      <w:pPr>
         <w:pStyle w:val="FirstParagraph"/>
-        <w:spacing w:before="0" w:after="40"/>
-      </w:pPr>
-      <w:r>
+        <w:spacing w:before="0" w:after="80" w:line="331" w:lineRule="auto"/>
+        <w:ind w:firstLine="440" w:left="0"/>
+      </w:pPr>
+      <w:r>
+        <w:rPr>
+          <w:rFonts w:hint="eastAsia" w:ascii="宋体" w:hAnsi="宋体" w:eastAsia="宋体"/>
+          <w:sz w:val="22"/>
+        </w:rPr>
+        <w:t xml:space="preserve">本课是浙江教育版小学信息科技四年级上册第三单元《身边的编码》第10课。教材依托课本第40~43页，从学生熟悉的学号登记表切入，引导学生理解散乱数据如何通过约定规则生成具有唯一标识作用的规范编码；进而结合门牌号、班牌、牛耳牌等生活实例，阐明编码保持社会秩序的科学基础；最后系统归纳纯数字、图形条码、经纬度及混合编码等多种呈现方式，为后续探索编码应用奠定基础。</w:t>
+      </w:r>
+    </w:p>
+    <w:bookmarkEnd w:id="9"/>
+    <w:bookmarkStart w:id="10" w:name="_二学情分析"/>
+    <w:p>
+      <w:pPr>
+        <w:pStyle w:val="2"/>
+        <w:spacing w:before="200" w:after="80" w:line="312" w:lineRule="auto"/>
+        <w:ind w:firstLine="0"/>
+        <w:jc w:val="left"/>
+      </w:pPr>
+      <w:r>
+        <w:rPr>
+          <w:rFonts w:hint="eastAsia" w:ascii="黑体" w:hAnsi="黑体" w:eastAsia="黑体"/>
+          <w:b/>
+          <w:color w:val="2E1F5E"/>
+          <w:sz w:val="26"/>
+        </w:rPr>
+        <w:t xml:space="preserve">二、学情分析</w:t>
+      </w:r>
+    </w:p>
+    <w:p>
+      <w:pPr>
+        <w:pStyle w:val="FirstParagraph"/>
+        <w:spacing w:before="0" w:after="80" w:line="331" w:lineRule="auto"/>
+        <w:ind w:firstLine="440" w:left="0"/>
+      </w:pPr>
+      <w:r>
+        <w:rPr>
+          <w:rFonts w:hint="eastAsia" w:ascii="宋体" w:hAnsi="宋体" w:eastAsia="宋体"/>
+          <w:sz w:val="22"/>
+        </w:rPr>
+        <w:t xml:space="preserve">四年级学生在日常生活中接触过学号、门牌、条形码等编码，但认知多停留在表面识读，缺乏对“编码规则”与“唯一标识”内在逻辑的系统理解。上机实操中容易出现将数据直接简单拼凑、忽略固定位数（如班级未补零导致长短不一）等典型卡点。</w:t>
+      </w:r>
+      <w:r>
+        <w:rPr>
+          <w:rFonts w:ascii="宋体" w:hAnsi="宋体" w:eastAsia="宋体"/>
+          <w:sz w:val="22"/>
+        </w:rPr>
         <w:br/>
+      </w:r>
+      <w:r>
+        <w:rPr>
+          <w:rFonts w:hint="eastAsia" w:ascii="宋体" w:hAnsi="宋体" w:eastAsia="宋体"/>
+          <w:sz w:val="22"/>
+        </w:rPr>
+        <w:t xml:space="preserve">针对四年级认知特点，本课搭建三大实战支架：</w:t>
+      </w:r>
+      <w:r>
+        <w:rPr>
+          <w:rFonts w:ascii="宋体" w:hAnsi="宋体" w:eastAsia="宋体"/>
+          <w:sz w:val="22"/>
+        </w:rPr>
+        <w:t xml:space="preserve"> </w:t>
+      </w:r>
+      <w:r>
+        <w:rPr>
+          <w:rFonts w:ascii="宋体" w:hAnsi="宋体" w:eastAsia="宋体"/>
+          <w:sz w:val="22"/>
+        </w:rPr>
+        <w:t xml:space="preserve">-</w:t>
+      </w:r>
+      <w:r>
+        <w:rPr>
+          <w:rFonts w:ascii="宋体" w:hAnsi="宋体" w:eastAsia="宋体"/>
+          <w:sz w:val="22"/>
+        </w:rPr>
+        <w:t xml:space="preserve"> </w:t>
+      </w:r>
+      <w:r>
+        <w:rPr>
+          <w:rFonts w:hint="eastAsia" w:ascii="宋体" w:hAnsi="宋体" w:eastAsia="宋体"/>
+          <w:b/>
+          <w:bCs/>
+          <w:sz w:val="22"/>
+        </w:rPr>
+        <w:t xml:space="preserve">生活通俗比喻</w:t>
+      </w:r>
+      <w:r>
+        <w:rPr>
+          <w:rFonts w:hint="eastAsia" w:ascii="宋体" w:hAnsi="宋体" w:eastAsia="宋体"/>
+          <w:sz w:val="22"/>
+        </w:rPr>
+        <w:t xml:space="preserve">：将散乱数据比作“零散积木”，将编码规则比作“拼装卡扣”，将编码结果比作事物的“数字身份证”；</w:t>
+      </w:r>
+      <w:r>
+        <w:rPr>
+          <w:rFonts w:ascii="宋体" w:hAnsi="宋体" w:eastAsia="宋体"/>
+          <w:sz w:val="22"/>
+        </w:rPr>
+        <w:t xml:space="preserve"> </w:t>
+      </w:r>
+      <w:r>
+        <w:rPr>
+          <w:rFonts w:ascii="宋体" w:hAnsi="宋体" w:eastAsia="宋体"/>
+          <w:sz w:val="22"/>
+        </w:rPr>
+        <w:t xml:space="preserve">-</w:t>
+      </w:r>
+      <w:r>
+        <w:rPr>
+          <w:rFonts w:ascii="宋体" w:hAnsi="宋体" w:eastAsia="宋体"/>
+          <w:sz w:val="22"/>
+        </w:rPr>
+        <w:t xml:space="preserve"> </w:t>
+      </w:r>
+      <w:r>
+        <w:rPr>
+          <w:rFonts w:hint="eastAsia" w:ascii="宋体" w:hAnsi="宋体" w:eastAsia="宋体"/>
+          <w:b/>
+          <w:bCs/>
+          <w:sz w:val="22"/>
+        </w:rPr>
+        <w:t xml:space="preserve">真实设问与追问</w:t>
+      </w:r>
+      <w:r>
+        <w:rPr>
+          <w:rFonts w:hint="eastAsia" w:ascii="宋体" w:hAnsi="宋体" w:eastAsia="宋体"/>
+          <w:sz w:val="22"/>
+        </w:rPr>
+        <w:t xml:space="preserve">：通过“学校借书系统重名怎么破”、“学号为什么要切成三段”等启发设问，驱动学生深度思考；</w:t>
+      </w:r>
+      <w:r>
+        <w:rPr>
+          <w:rFonts w:ascii="宋体" w:hAnsi="宋体" w:eastAsia="宋体"/>
+          <w:sz w:val="22"/>
+        </w:rPr>
+        <w:t xml:space="preserve"> </w:t>
+      </w:r>
+      <w:r>
+        <w:rPr>
+          <w:rFonts w:ascii="宋体" w:hAnsi="宋体" w:eastAsia="宋体"/>
+          <w:sz w:val="22"/>
+        </w:rPr>
+        <w:t xml:space="preserve">-</w:t>
+      </w:r>
+      <w:r>
+        <w:rPr>
+          <w:rFonts w:ascii="宋体" w:hAnsi="宋体" w:eastAsia="宋体"/>
+          <w:sz w:val="22"/>
+        </w:rPr>
+        <w:t xml:space="preserve"> </w:t>
+      </w:r>
+      <w:r>
+        <w:rPr>
+          <w:rFonts w:hint="eastAsia" w:ascii="宋体" w:hAnsi="宋体" w:eastAsia="宋体"/>
+          <w:b/>
+          <w:bCs/>
+          <w:sz w:val="22"/>
+        </w:rPr>
+        <w:t xml:space="preserve">避坑预警锦囊</w:t>
+      </w:r>
+      <w:r>
+        <w:rPr>
+          <w:rFonts w:hint="eastAsia" w:ascii="宋体" w:hAnsi="宋体" w:eastAsia="宋体"/>
+          <w:sz w:val="22"/>
+        </w:rPr>
+        <w:t xml:space="preserve">：重点点拨“位数不足前面补零”的规范，以及地铁车门混合编码中“A左B右”的识别技巧。</w:t>
+      </w:r>
+    </w:p>
+    <w:bookmarkEnd w:id="10"/>
+    <w:bookmarkStart w:id="11" w:name="_三教学目标"/>
+    <w:p>
+      <w:pPr>
+        <w:pStyle w:val="2"/>
+        <w:spacing w:before="200" w:after="80" w:line="312" w:lineRule="auto"/>
+        <w:ind w:firstLine="0"/>
+        <w:jc w:val="left"/>
+      </w:pPr>
+      <w:r>
+        <w:rPr>
+          <w:rFonts w:hint="eastAsia" w:ascii="黑体" w:hAnsi="黑体" w:eastAsia="黑体"/>
+          <w:b/>
+          <w:color w:val="2E1F5E"/>
+          <w:sz w:val="26"/>
+        </w:rPr>
+        <w:t xml:space="preserve">三、教学目标</w:t>
+      </w:r>
+    </w:p>
+    <w:p>
+      <w:pPr>
+        <w:pStyle w:val="Compact"/>
+        <w:numPr>
+          <w:ilvl w:val="0"/>
+          <w:numId w:val="1001"/>
+        </w:numPr>
+        <w:spacing w:before="0" w:after="60" w:line="312" w:lineRule="auto"/>
+        <w:ind w:firstLine="0" w:left="280"/>
+      </w:pPr>
+      <w:r>
+        <w:rPr>
+          <w:rFonts w:hint="eastAsia" w:ascii="宋体" w:hAnsi="宋体" w:eastAsia="宋体"/>
+          <w:b/>
+          <w:bCs/>
+          <w:sz w:val="21"/>
+        </w:rPr>
+        <w:t xml:space="preserve">信息意识</w:t>
+      </w:r>
+      <w:r>
+        <w:rPr>
+          <w:rFonts w:hint="eastAsia" w:ascii="宋体" w:hAnsi="宋体" w:eastAsia="宋体"/>
+          <w:sz w:val="21"/>
+        </w:rPr>
+        <w:t xml:space="preserve">：感知身边广泛存在的编码，认识手机号、条形码等均为规范数据，体会编码是事物的“唯一数字身份证”，树立保护个人关键编码隐私的安全自律意识。</w:t>
+      </w:r>
+    </w:p>
+    <w:p>
+      <w:pPr>
+        <w:pStyle w:val="Compact"/>
+        <w:numPr>
+          <w:ilvl w:val="0"/>
+          <w:numId w:val="1001"/>
+        </w:numPr>
+        <w:spacing w:before="0" w:after="60" w:line="312" w:lineRule="auto"/>
+        <w:ind w:firstLine="0" w:left="280"/>
+      </w:pPr>
+      <w:r>
+        <w:rPr>
+          <w:rFonts w:hint="eastAsia" w:ascii="宋体" w:hAnsi="宋体" w:eastAsia="宋体"/>
+          <w:b/>
+          <w:bCs/>
+          <w:sz w:val="21"/>
+        </w:rPr>
+        <w:t xml:space="preserve">计算思维</w:t>
+      </w:r>
+      <w:r>
+        <w:rPr>
+          <w:rFonts w:hint="eastAsia" w:ascii="宋体" w:hAnsi="宋体" w:eastAsia="宋体"/>
+          <w:sz w:val="21"/>
+        </w:rPr>
+        <w:t xml:space="preserve">：经历从生活数据到编码规则的抽象过程，能拆解分析学号、车门编号的字符段与属性映射关系，初步建立规则编排与数字化建模思维。</w:t>
+      </w:r>
+    </w:p>
+    <w:p>
+      <w:pPr>
+        <w:pStyle w:val="Compact"/>
+        <w:numPr>
+          <w:ilvl w:val="0"/>
+          <w:numId w:val="1001"/>
+        </w:numPr>
+        <w:spacing w:before="0" w:after="60" w:line="312" w:lineRule="auto"/>
+        <w:ind w:firstLine="0" w:left="280"/>
+      </w:pPr>
+      <w:r>
+        <w:rPr>
+          <w:rFonts w:hint="eastAsia" w:ascii="宋体" w:hAnsi="宋体" w:eastAsia="宋体"/>
+          <w:b/>
+          <w:bCs/>
+          <w:sz w:val="21"/>
+        </w:rPr>
+        <w:t xml:space="preserve">数字化学习与创新</w:t>
+      </w:r>
+      <w:r>
+        <w:rPr>
+          <w:rFonts w:hint="eastAsia" w:ascii="宋体" w:hAnsi="宋体" w:eastAsia="宋体"/>
+          <w:sz w:val="21"/>
+        </w:rPr>
+        <w:t xml:space="preserve">：熟练完成课堂导学单纸笔任务，能在单文件互动课件中开展学号拼装速配与微型车门破译仿真，提升数字化探究能力。</w:t>
+      </w:r>
+    </w:p>
+    <w:p>
+      <w:pPr>
+        <w:pStyle w:val="Compact"/>
+        <w:numPr>
+          <w:ilvl w:val="0"/>
+          <w:numId w:val="1001"/>
+        </w:numPr>
+        <w:spacing w:before="0" w:after="60" w:line="312" w:lineRule="auto"/>
+        <w:ind w:firstLine="0" w:left="280"/>
+      </w:pPr>
+      <w:r>
+        <w:rPr>
+          <w:rFonts w:hint="eastAsia" w:ascii="宋体" w:hAnsi="宋体" w:eastAsia="宋体"/>
+          <w:b/>
+          <w:bCs/>
+          <w:sz w:val="21"/>
+        </w:rPr>
+        <w:t xml:space="preserve">信息社会责任</w:t>
+      </w:r>
+      <w:r>
+        <w:rPr>
+          <w:rFonts w:hint="eastAsia" w:ascii="宋体" w:hAnsi="宋体" w:eastAsia="宋体"/>
+          <w:sz w:val="21"/>
+        </w:rPr>
+        <w:t xml:space="preserve">：理解规范编码是保障社会高效有序运转的科学基础，自觉遵守各类信息系统的编码规则与机房上机守则。</w:t>
+      </w:r>
+    </w:p>
+    <w:bookmarkEnd w:id="11"/>
+    <w:bookmarkStart w:id="12" w:name="_四教学重点"/>
+    <w:p>
+      <w:pPr>
+        <w:pStyle w:val="2"/>
+        <w:spacing w:before="200" w:after="80" w:line="312" w:lineRule="auto"/>
+        <w:ind w:firstLine="0"/>
+        <w:jc w:val="left"/>
+      </w:pPr>
+      <w:r>
+        <w:rPr>
+          <w:rFonts w:hint="eastAsia" w:ascii="黑体" w:hAnsi="黑体" w:eastAsia="黑体"/>
+          <w:b/>
+          <w:color w:val="2E1F5E"/>
+          <w:sz w:val="26"/>
+        </w:rPr>
+        <w:t xml:space="preserve">四、教学重点</w:t>
+      </w:r>
+    </w:p>
+    <w:p>
+      <w:pPr>
+        <w:pStyle w:val="FirstParagraph"/>
+        <w:spacing w:before="0" w:after="80" w:line="331" w:lineRule="auto"/>
+        <w:ind w:firstLine="440" w:left="0"/>
+      </w:pPr>
+      <w:r>
+        <w:rPr>
+          <w:rFonts w:hint="eastAsia" w:ascii="宋体" w:hAnsi="宋体" w:eastAsia="宋体"/>
+          <w:sz w:val="22"/>
+        </w:rPr>
+        <w:t xml:space="preserve">理解数据与编码的映射关系，认识编码具有唯一标识和保持秩序的作用；掌握纯数字、图形条码、经纬度及混合编码等呈现方式。</w:t>
+      </w:r>
+    </w:p>
+    <w:bookmarkEnd w:id="12"/>
+    <w:bookmarkStart w:id="13" w:name="_五教学难点"/>
+    <w:p>
+      <w:pPr>
+        <w:pStyle w:val="2"/>
+        <w:spacing w:before="200" w:after="80" w:line="312" w:lineRule="auto"/>
+        <w:ind w:firstLine="0"/>
+        <w:jc w:val="left"/>
+      </w:pPr>
+      <w:r>
+        <w:rPr>
+          <w:rFonts w:hint="eastAsia" w:ascii="黑体" w:hAnsi="黑体" w:eastAsia="黑体"/>
+          <w:b/>
+          <w:color w:val="2E1F5E"/>
+          <w:sz w:val="26"/>
+        </w:rPr>
+        <w:t xml:space="preserve">五、教学难点</w:t>
+      </w:r>
+    </w:p>
+    <w:p>
+      <w:pPr>
+        <w:pStyle w:val="FirstParagraph"/>
+        <w:spacing w:before="0" w:after="80" w:line="331" w:lineRule="auto"/>
+        <w:ind w:firstLine="440" w:left="0"/>
+      </w:pPr>
+      <w:r>
+        <w:rPr>
+          <w:rFonts w:hint="eastAsia" w:ascii="宋体" w:hAnsi="宋体" w:eastAsia="宋体"/>
+          <w:sz w:val="22"/>
+        </w:rPr>
+        <w:t xml:space="preserve">理解分散数据如何通过约定规则整合成具有确定逻辑意义的规范编码；准确破译地铁车门混合编码各字段的实际映射含义。</w:t>
+      </w:r>
+    </w:p>
+    <w:bookmarkEnd w:id="13"/>
+    <w:bookmarkStart w:id="14" w:name="_六教学过程"/>
+    <w:p>
+      <w:pPr>
+        <w:pStyle w:val="2"/>
+        <w:spacing w:before="200" w:after="80" w:line="312" w:lineRule="auto"/>
+        <w:ind w:firstLine="0"/>
+        <w:jc w:val="left"/>
+      </w:pPr>
+      <w:r>
+        <w:rPr>
+          <w:rFonts w:hint="eastAsia" w:ascii="黑体" w:hAnsi="黑体" w:eastAsia="黑体"/>
+          <w:b/>
+          <w:color w:val="2E1F5E"/>
+          <w:sz w:val="26"/>
+        </w:rPr>
+        <w:t xml:space="preserve">六、教学过程</w:t>
       </w:r>
     </w:p>
     <w:tbl>
@@ -724,10 +715,10 @@
         </w:tblCellMar>
       </w:tblPr>
       <w:tblGrid>
-        <w:gridCol w:w="733"/>
-        <w:gridCol w:w="3006"/>
-        <w:gridCol w:w="2713"/>
-        <w:gridCol w:w="1466"/>
+        <w:gridCol w:w="887"/>
+        <w:gridCol w:w="3345"/>
+        <w:gridCol w:w="2321"/>
+        <w:gridCol w:w="1365"/>
       </w:tblGrid>
       <w:tr>
         <w:trPr>
@@ -775,6 +766,22 @@
               </w:rPr>
               <w:t xml:space="preserve">教师活动</w:t>
             </w:r>
+            <w:r>
+              <w:rPr>
+                <w:rFonts w:ascii="黑体" w:hAnsi="黑体" w:eastAsia="黑体"/>
+                <w:b/>
+                <w:sz w:val="20"/>
+              </w:rPr>
+              <w:t xml:space="preserve"> </w:t>
+            </w:r>
+            <w:r>
+              <w:rPr>
+                <w:rFonts w:hint="eastAsia" w:ascii="黑体" w:hAnsi="黑体" w:eastAsia="黑体"/>
+                <w:b/>
+                <w:sz w:val="20"/>
+              </w:rPr>
+              <w:t xml:space="preserve">(含设问·比喻·支架·点拨)</w:t>
+            </w:r>
           </w:p>
         </w:tc>
         <w:tc>
@@ -796,6 +803,22 @@
                 <w:sz w:val="20"/>
               </w:rPr>
               <w:t xml:space="preserve">学生活动</w:t>
+            </w:r>
+            <w:r>
+              <w:rPr>
+                <w:rFonts w:ascii="黑体" w:hAnsi="黑体" w:eastAsia="黑体"/>
+                <w:b/>
+                <w:sz w:val="20"/>
+              </w:rPr>
+              <w:t xml:space="preserve"> </w:t>
+            </w:r>
+            <w:r>
+              <w:rPr>
+                <w:rFonts w:hint="eastAsia" w:ascii="黑体" w:hAnsi="黑体" w:eastAsia="黑体"/>
+                <w:b/>
+                <w:sz w:val="20"/>
+              </w:rPr>
+              <w:t xml:space="preserve">(一人一机)</w:t>
             </w:r>
           </w:p>
         </w:tc>
@@ -842,7 +865,39 @@
                 <w:bCs/>
                 <w:sz w:val="20"/>
               </w:rPr>
-              <w:t xml:space="preserve">情境导入</w:t>
+              <w:t xml:space="preserve">一、情境激趣</w:t>
+            </w:r>
+            <w:r>
+              <w:rPr>
+                <w:rFonts w:ascii="宋体" w:hAnsi="宋体" w:eastAsia="宋体"/>
+                <w:sz w:val="20"/>
+              </w:rPr>
+              <w:br/>
+            </w:r>
+            <w:r>
+              <w:rPr>
+                <w:rFonts w:hint="eastAsia" w:ascii="宋体" w:hAnsi="宋体" w:eastAsia="宋体"/>
+                <w:b/>
+                <w:bCs/>
+                <w:sz w:val="20"/>
+              </w:rPr>
+              <w:t xml:space="preserve">引出课题</w:t>
+            </w:r>
+            <w:r>
+              <w:rPr>
+                <w:rFonts w:ascii="宋体" w:hAnsi="宋体" w:eastAsia="宋体"/>
+                <w:sz w:val="20"/>
+              </w:rPr>
+              <w:br/>
+            </w:r>
+            <w:r>
+              <w:rPr>
+                <w:rFonts w:hint="eastAsia" w:ascii="宋体" w:hAnsi="宋体" w:eastAsia="宋体"/>
+                <w:b/>
+                <w:bCs/>
+                <w:sz w:val="20"/>
+              </w:rPr>
+              <w:t xml:space="preserve">(4分钟)</w:t>
             </w:r>
           </w:p>
         </w:tc>
@@ -878,14 +933,14 @@
                 <w:bCs/>
                 <w:sz w:val="20"/>
               </w:rPr>
-              <w:t xml:space="preserve">情境激趣：重名带来的小困扰</w:t>
-            </w:r>
-            <w:r>
-              <w:rPr>
-                <w:rFonts w:hint="eastAsia" w:ascii="宋体" w:hAnsi="宋体" w:eastAsia="宋体"/>
-                <w:sz w:val="20"/>
-              </w:rPr>
-              <w:t xml:space="preserve">：</w:t>
+              <w:t xml:space="preserve">情境激趣（重名的小烦恼）</w:t>
+            </w:r>
+            <w:r>
+              <w:rPr>
+                <w:rFonts w:hint="eastAsia" w:ascii="宋体" w:hAnsi="宋体" w:eastAsia="宋体"/>
+                <w:sz w:val="20"/>
+              </w:rPr>
+              <w:t xml:space="preserve">：出示图书借阅系统输入“李强”弹出全校6位同名学生的困扰。</w:t>
             </w:r>
             <w:r>
               <w:rPr>
@@ -899,28 +954,7 @@
                 <w:rFonts w:ascii="宋体" w:hAnsi="宋体" w:eastAsia="宋体"/>
                 <w:sz w:val="20"/>
               </w:rPr>
-              <w:t xml:space="preserve">- </w:t>
-            </w:r>
-            <w:r>
-              <w:rPr>
-                <w:rFonts w:hint="eastAsia" w:ascii="宋体" w:hAnsi="宋体" w:eastAsia="宋体"/>
-                <w:sz w:val="20"/>
-              </w:rPr>
-              <w:t xml:space="preserve">课前展示情境：“学校借书系统里输入‘李强’，弹出全校6个同名同学！图书管理员怎样才能秒认出究竟是谁借了书？”</w:t>
-            </w:r>
-            <w:r>
-              <w:rPr>
-                <w:rFonts w:ascii="宋体" w:hAnsi="宋体" w:eastAsia="宋体"/>
-                <w:sz w:val="20"/>
-              </w:rPr>
-              <w:br/>
-            </w:r>
-            <w:r>
-              <w:rPr>
-                <w:rFonts w:ascii="宋体" w:hAnsi="宋体" w:eastAsia="宋体"/>
-                <w:sz w:val="20"/>
-              </w:rPr>
-              <w:t xml:space="preserve">-</w:t>
+              <w:t xml:space="preserve">2.</w:t>
             </w:r>
             <w:r>
               <w:rPr>
@@ -943,7 +977,7 @@
                 <w:rFonts w:hint="eastAsia" w:ascii="宋体" w:hAnsi="宋体" w:eastAsia="宋体"/>
                 <w:sz w:val="20"/>
               </w:rPr>
-              <w:t xml:space="preserve">：“大家想想，在校园中，有没有一种暗号像专属‘数字身份证’一样，无论姓名怎么重样都能独一无二、一眼认出？”</w:t>
+              <w:t xml:space="preserve">：“有没有一种暗号像专属‘数字身份证’一样，无论姓名怎么重样都能一眼认出？”引出“学号”。</w:t>
             </w:r>
             <w:r>
               <w:rPr>
@@ -957,28 +991,7 @@
                 <w:rFonts w:ascii="宋体" w:hAnsi="宋体" w:eastAsia="宋体"/>
                 <w:sz w:val="20"/>
               </w:rPr>
-              <w:t xml:space="preserve">- </w:t>
-            </w:r>
-            <w:r>
-              <w:rPr>
-                <w:rFonts w:hint="eastAsia" w:ascii="宋体" w:hAnsi="宋体" w:eastAsia="宋体"/>
-                <w:sz w:val="20"/>
-              </w:rPr>
-              <w:t xml:space="preserve">引导学生齐答：“学号！”或者“身份证号！”</w:t>
-            </w:r>
-            <w:r>
-              <w:rPr>
-                <w:rFonts w:ascii="宋体" w:hAnsi="宋体" w:eastAsia="宋体"/>
-                <w:sz w:val="20"/>
-              </w:rPr>
-              <w:br/>
-            </w:r>
-            <w:r>
-              <w:rPr>
-                <w:rFonts w:ascii="宋体" w:hAnsi="宋体" w:eastAsia="宋体"/>
-                <w:sz w:val="20"/>
-              </w:rPr>
-              <w:t xml:space="preserve">-</w:t>
+              <w:t xml:space="preserve">3.</w:t>
             </w:r>
             <w:r>
               <w:rPr>
@@ -1001,7 +1014,21 @@
                 <w:rFonts w:hint="eastAsia" w:ascii="宋体" w:hAnsi="宋体" w:eastAsia="宋体"/>
                 <w:sz w:val="20"/>
               </w:rPr>
-              <w:t xml:space="preserve">：教师引入：“正是这些奇妙的数字密码让世界井然有序。今天我们一起学习第10课《从数据到编码》！”</w:t>
+              <w:t xml:space="preserve">：板书课题《第10课</w:t>
+            </w:r>
+            <w:r>
+              <w:rPr>
+                <w:rFonts w:ascii="宋体" w:hAnsi="宋体" w:eastAsia="宋体"/>
+                <w:sz w:val="20"/>
+              </w:rPr>
+              <w:t xml:space="preserve"> </w:t>
+            </w:r>
+            <w:r>
+              <w:rPr>
+                <w:rFonts w:hint="eastAsia" w:ascii="宋体" w:hAnsi="宋体" w:eastAsia="宋体"/>
+                <w:sz w:val="20"/>
+              </w:rPr>
+              <w:t xml:space="preserve">从数据到编码》。</w:t>
             </w:r>
           </w:p>
         </w:tc>
@@ -1028,7 +1055,7 @@
                 <w:rFonts w:hint="eastAsia" w:ascii="宋体" w:hAnsi="宋体" w:eastAsia="宋体"/>
                 <w:sz w:val="20"/>
               </w:rPr>
-              <w:t xml:space="preserve">观看借书同名情境，结合经历讨论重名困扰。</w:t>
+              <w:t xml:space="preserve">观察借书重名情境，结合生活体验讨论重名困扰。</w:t>
             </w:r>
             <w:r>
               <w:rPr>
@@ -1049,7 +1076,7 @@
                 <w:rFonts w:hint="eastAsia" w:ascii="宋体" w:hAnsi="宋体" w:eastAsia="宋体"/>
                 <w:sz w:val="20"/>
               </w:rPr>
-              <w:t xml:space="preserve">积极回答提问，联想到学号与身份证，初步体会唯一标识的作用。</w:t>
+              <w:t xml:space="preserve">积极抢答，联想到学号、身份证号的唯一性。</w:t>
             </w:r>
             <w:r>
               <w:rPr>
@@ -1070,7 +1097,7 @@
                 <w:rFonts w:hint="eastAsia" w:ascii="宋体" w:hAnsi="宋体" w:eastAsia="宋体"/>
                 <w:sz w:val="20"/>
               </w:rPr>
-              <w:t xml:space="preserve">明确本课主题，激发探究兴趣。</w:t>
+              <w:t xml:space="preserve">明确本课通关目标。</w:t>
             </w:r>
           </w:p>
         </w:tc>
@@ -1090,7 +1117,7 @@
                 <w:rFonts w:hint="eastAsia" w:ascii="宋体" w:hAnsi="宋体" w:eastAsia="宋体"/>
                 <w:sz w:val="20"/>
               </w:rPr>
-              <w:t xml:space="preserve">创设真实校园情境，通过生动设问迅速抓住注意力，将抽象编码概念转化为解决实际问题的需求，唤醒生活经验。</w:t>
+              <w:t xml:space="preserve">以生活真实冲突切入，唤醒生活经验，自然引出编码与唯一标识概念。</w:t>
             </w:r>
           </w:p>
         </w:tc>
@@ -1115,7 +1142,39 @@
                 <w:bCs/>
                 <w:sz w:val="20"/>
               </w:rPr>
-              <w:t xml:space="preserve">新知探究</w:t>
+              <w:t xml:space="preserve">二、解密学号</w:t>
+            </w:r>
+            <w:r>
+              <w:rPr>
+                <w:rFonts w:ascii="宋体" w:hAnsi="宋体" w:eastAsia="宋体"/>
+                <w:sz w:val="20"/>
+              </w:rPr>
+              <w:br/>
+            </w:r>
+            <w:r>
+              <w:rPr>
+                <w:rFonts w:hint="eastAsia" w:ascii="宋体" w:hAnsi="宋体" w:eastAsia="宋体"/>
+                <w:b/>
+                <w:bCs/>
+                <w:sz w:val="20"/>
+              </w:rPr>
+              <w:t xml:space="preserve">探究编码规则</w:t>
+            </w:r>
+            <w:r>
+              <w:rPr>
+                <w:rFonts w:ascii="宋体" w:hAnsi="宋体" w:eastAsia="宋体"/>
+                <w:sz w:val="20"/>
+              </w:rPr>
+              <w:br/>
+            </w:r>
+            <w:r>
+              <w:rPr>
+                <w:rFonts w:hint="eastAsia" w:ascii="宋体" w:hAnsi="宋体" w:eastAsia="宋体"/>
+                <w:b/>
+                <w:bCs/>
+                <w:sz w:val="20"/>
+              </w:rPr>
+              <w:t xml:space="preserve">(8分钟)</w:t>
             </w:r>
           </w:p>
         </w:tc>
@@ -1151,14 +1210,14 @@
                 <w:bCs/>
                 <w:sz w:val="20"/>
               </w:rPr>
-              <w:t xml:space="preserve">第一站：解密学号——从散乱数据到有序编码（课本P40）</w:t>
-            </w:r>
-            <w:r>
-              <w:rPr>
-                <w:rFonts w:hint="eastAsia" w:ascii="宋体" w:hAnsi="宋体" w:eastAsia="宋体"/>
-                <w:sz w:val="20"/>
-              </w:rPr>
-              <w:t xml:space="preserve">：</w:t>
+              <w:t xml:space="preserve">出示P40学号登记表</w:t>
+            </w:r>
+            <w:r>
+              <w:rPr>
+                <w:rFonts w:hint="eastAsia" w:ascii="宋体" w:hAnsi="宋体" w:eastAsia="宋体"/>
+                <w:sz w:val="20"/>
+              </w:rPr>
+              <w:t xml:space="preserve">：展示黄科、程正、徐一飞、周雨欣的学号信息。</w:t>
             </w:r>
             <w:r>
               <w:rPr>
@@ -1172,7 +1231,7 @@
                 <w:rFonts w:ascii="宋体" w:hAnsi="宋体" w:eastAsia="宋体"/>
                 <w:sz w:val="20"/>
               </w:rPr>
-              <w:t xml:space="preserve">-</w:t>
+              <w:t xml:space="preserve">2.</w:t>
             </w:r>
             <w:r>
               <w:rPr>
@@ -1188,14 +1247,14 @@
                 <w:bCs/>
                 <w:sz w:val="20"/>
               </w:rPr>
-              <w:t xml:space="preserve">出示P40探索表格</w:t>
-            </w:r>
-            <w:r>
-              <w:rPr>
-                <w:rFonts w:hint="eastAsia" w:ascii="宋体" w:hAnsi="宋体" w:eastAsia="宋体"/>
-                <w:sz w:val="20"/>
-              </w:rPr>
-              <w:t xml:space="preserve">：展示黄科、程正、徐一飞、周雨欣的《学生学号登记表》。</w:t>
+              <w:t xml:space="preserve">启发追问</w:t>
+            </w:r>
+            <w:r>
+              <w:rPr>
+                <w:rFonts w:hint="eastAsia" w:ascii="宋体" w:hAnsi="宋体" w:eastAsia="宋体"/>
+                <w:sz w:val="20"/>
+              </w:rPr>
+              <w:t xml:space="preserve">：“黄科同学的班级（3班）、入学年份（2022）、排序（39）和学号‘20220339’有什么联系？”</w:t>
             </w:r>
             <w:r>
               <w:rPr>
@@ -1209,7 +1268,7 @@
                 <w:rFonts w:ascii="宋体" w:hAnsi="宋体" w:eastAsia="宋体"/>
                 <w:sz w:val="20"/>
               </w:rPr>
-              <w:t xml:space="preserve">-</w:t>
+              <w:t xml:space="preserve">3.</w:t>
             </w:r>
             <w:r>
               <w:rPr>
@@ -1225,14 +1284,14 @@
                 <w:bCs/>
                 <w:sz w:val="20"/>
               </w:rPr>
-              <w:t xml:space="preserve">启发追问</w:t>
-            </w:r>
-            <w:r>
-              <w:rPr>
-                <w:rFonts w:hint="eastAsia" w:ascii="宋体" w:hAnsi="宋体" w:eastAsia="宋体"/>
-                <w:sz w:val="20"/>
-              </w:rPr>
-              <w:t xml:space="preserve">：</w:t>
+              <w:t xml:space="preserve">比喻与避坑点拨</w:t>
+            </w:r>
+            <w:r>
+              <w:rPr>
+                <w:rFonts w:hint="eastAsia" w:ascii="宋体" w:hAnsi="宋体" w:eastAsia="宋体"/>
+                <w:sz w:val="20"/>
+              </w:rPr>
+              <w:t xml:space="preserve">：散乱数据如同零散积木，规则是拼装卡扣；点拨“位数不足前面补零（03班）”的重要规范，防止计算机检索混乱。</w:t>
             </w:r>
             <w:r>
               <w:rPr>
@@ -1246,63 +1305,7 @@
                 <w:rFonts w:ascii="宋体" w:hAnsi="宋体" w:eastAsia="宋体"/>
                 <w:sz w:val="20"/>
               </w:rPr>
-              <w:t xml:space="preserve"> </w:t>
-            </w:r>
-            <w:r>
-              <w:rPr>
-                <w:rFonts w:ascii="宋体" w:hAnsi="宋体" w:eastAsia="宋体"/>
-                <w:sz w:val="20"/>
-              </w:rPr>
-              <w:t xml:space="preserve">· </w:t>
-            </w:r>
-            <w:r>
-              <w:rPr>
-                <w:rFonts w:hint="eastAsia" w:ascii="宋体" w:hAnsi="宋体" w:eastAsia="宋体"/>
-                <w:sz w:val="20"/>
-              </w:rPr>
-              <w:t xml:space="preserve">设问一：“请看黄科同学，她的班级（3班）、入学年份（2022）、出生日期排序（39），和学号‘20220339’有什么联系？”</w:t>
-            </w:r>
-            <w:r>
-              <w:rPr>
-                <w:rFonts w:ascii="宋体" w:hAnsi="宋体" w:eastAsia="宋体"/>
-                <w:sz w:val="20"/>
-              </w:rPr>
-              <w:br/>
-            </w:r>
-            <w:r>
-              <w:rPr>
-                <w:rFonts w:ascii="宋体" w:hAnsi="宋体" w:eastAsia="宋体"/>
-                <w:sz w:val="20"/>
-              </w:rPr>
-              <w:t xml:space="preserve"> </w:t>
-            </w:r>
-            <w:r>
-              <w:rPr>
-                <w:rFonts w:ascii="宋体" w:hAnsi="宋体" w:eastAsia="宋体"/>
-                <w:sz w:val="20"/>
-              </w:rPr>
-              <w:t xml:space="preserve">· </w:t>
-            </w:r>
-            <w:r>
-              <w:rPr>
-                <w:rFonts w:hint="eastAsia" w:ascii="宋体" w:hAnsi="宋体" w:eastAsia="宋体"/>
-                <w:sz w:val="20"/>
-              </w:rPr>
-              <w:t xml:space="preserve">设问二：“谁能把这串数字切成三段积木？分别代表什么？”</w:t>
-            </w:r>
-            <w:r>
-              <w:rPr>
-                <w:rFonts w:ascii="宋体" w:hAnsi="宋体" w:eastAsia="宋体"/>
-                <w:sz w:val="20"/>
-              </w:rPr>
-              <w:br/>
-            </w:r>
-            <w:r>
-              <w:rPr>
-                <w:rFonts w:ascii="宋体" w:hAnsi="宋体" w:eastAsia="宋体"/>
-                <w:sz w:val="20"/>
-              </w:rPr>
-              <w:t xml:space="preserve">-</w:t>
+              <w:t xml:space="preserve">4.</w:t>
             </w:r>
             <w:r>
               <w:rPr>
@@ -1318,665 +1321,14 @@
                 <w:bCs/>
                 <w:sz w:val="20"/>
               </w:rPr>
-              <w:t xml:space="preserve">通俗生活比喻</w:t>
-            </w:r>
-            <w:r>
-              <w:rPr>
-                <w:rFonts w:hint="eastAsia" w:ascii="宋体" w:hAnsi="宋体" w:eastAsia="宋体"/>
-                <w:sz w:val="20"/>
-              </w:rPr>
-              <w:t xml:space="preserve">：“散乱数据就像零散的积木，单看数字‘3’并不明确；而编码就是一套拼装规则，按顺序卡扣在一起，就成了唯一的身份证！”</w:t>
-            </w:r>
-            <w:r>
-              <w:rPr>
-                <w:rFonts w:ascii="宋体" w:hAnsi="宋体" w:eastAsia="宋体"/>
-                <w:sz w:val="20"/>
-              </w:rPr>
-              <w:br/>
-            </w:r>
-            <w:r>
-              <w:rPr>
-                <w:rFonts w:ascii="宋体" w:hAnsi="宋体" w:eastAsia="宋体"/>
-                <w:sz w:val="20"/>
-              </w:rPr>
-              <w:t xml:space="preserve">-</w:t>
-            </w:r>
-            <w:r>
-              <w:rPr>
-                <w:rFonts w:ascii="宋体" w:hAnsi="宋体" w:eastAsia="宋体"/>
-                <w:sz w:val="20"/>
-              </w:rPr>
-              <w:t xml:space="preserve"> </w:t>
-            </w:r>
-            <w:r>
-              <w:rPr>
-                <w:rFonts w:hint="eastAsia" w:ascii="宋体" w:hAnsi="宋体" w:eastAsia="宋体"/>
-                <w:b/>
-                <w:bCs/>
-                <w:sz w:val="20"/>
-              </w:rPr>
-              <w:t xml:space="preserve">实操踩坑预警与避坑锦囊</w:t>
-            </w:r>
-            <w:r>
-              <w:rPr>
-                <w:rFonts w:hint="eastAsia" w:ascii="宋体" w:hAnsi="宋体" w:eastAsia="宋体"/>
-                <w:sz w:val="20"/>
-              </w:rPr>
-              <w:t xml:space="preserve">：</w:t>
-            </w:r>
-            <w:r>
-              <w:rPr>
-                <w:rFonts w:ascii="宋体" w:hAnsi="宋体" w:eastAsia="宋体"/>
-                <w:sz w:val="20"/>
-              </w:rPr>
-              <w:br/>
-            </w:r>
-            <w:r>
-              <w:rPr>
-                <w:rFonts w:ascii="宋体" w:hAnsi="宋体" w:eastAsia="宋体"/>
-                <w:sz w:val="20"/>
-              </w:rPr>
-              <w:t xml:space="preserve"> </w:t>
-            </w:r>
-            <w:r>
-              <w:rPr>
-                <w:rFonts w:ascii="宋体" w:hAnsi="宋体" w:eastAsia="宋体"/>
-                <w:sz w:val="20"/>
-              </w:rPr>
-              <w:t xml:space="preserve">· </w:t>
-            </w:r>
-            <w:r>
-              <w:rPr>
-                <w:rFonts w:hint="eastAsia" w:ascii="宋体" w:hAnsi="宋体" w:eastAsia="宋体"/>
-                <w:sz w:val="20"/>
-              </w:rPr>
-              <w:t xml:space="preserve">提示易错点：“明明是3班，学号里为什么写‘03’？如果写成3，学号就只有7位，位数不一会导致计算机检索混乱！因此位数不够前面补零，是数字化编码的重要规范！”</w:t>
-            </w:r>
-            <w:r>
-              <w:rPr>
-                <w:rFonts w:ascii="宋体" w:hAnsi="宋体" w:eastAsia="宋体"/>
-                <w:sz w:val="20"/>
-              </w:rPr>
-              <w:br/>
-            </w:r>
-            <w:r>
-              <w:rPr>
-                <w:rFonts w:ascii="宋体" w:hAnsi="宋体" w:eastAsia="宋体"/>
-                <w:sz w:val="20"/>
-              </w:rPr>
-              <w:t xml:space="preserve">-</w:t>
-            </w:r>
-            <w:r>
-              <w:rPr>
-                <w:rFonts w:ascii="宋体" w:hAnsi="宋体" w:eastAsia="宋体"/>
-                <w:sz w:val="20"/>
-              </w:rPr>
-              <w:t xml:space="preserve"> </w:t>
-            </w:r>
-            <w:r>
-              <w:rPr>
-                <w:rFonts w:hint="eastAsia" w:ascii="宋体" w:hAnsi="宋体" w:eastAsia="宋体"/>
-                <w:b/>
-                <w:bCs/>
-                <w:sz w:val="20"/>
-              </w:rPr>
-              <w:t xml:space="preserve">小试牛刀</w:t>
-            </w:r>
-            <w:r>
-              <w:rPr>
-                <w:rFonts w:hint="eastAsia" w:ascii="宋体" w:hAnsi="宋体" w:eastAsia="宋体"/>
-                <w:sz w:val="20"/>
-              </w:rPr>
-              <w:t xml:space="preserve">：学生在导学单第一关补齐周雨欣（4班、2022年入学、出生排序02）学号为“20220402”。</w:t>
-            </w:r>
-            <w:r>
-              <w:rPr>
-                <w:rFonts w:ascii="宋体" w:hAnsi="宋体" w:eastAsia="宋体"/>
-                <w:sz w:val="20"/>
-              </w:rPr>
-              <w:br/>
-            </w:r>
-            <w:r>
-              <w:rPr>
-                <w:rFonts w:ascii="宋体" w:hAnsi="宋体" w:eastAsia="宋体"/>
-                <w:sz w:val="20"/>
-              </w:rPr>
-              <w:br/>
-            </w:r>
-            <w:r>
-              <w:rPr>
-                <w:rFonts w:ascii="宋体" w:hAnsi="宋体" w:eastAsia="宋体"/>
-                <w:sz w:val="20"/>
-              </w:rPr>
-              <w:t xml:space="preserve">2.</w:t>
-            </w:r>
-            <w:r>
-              <w:rPr>
-                <w:rFonts w:ascii="宋体" w:hAnsi="宋体" w:eastAsia="宋体"/>
-                <w:sz w:val="20"/>
-              </w:rPr>
-              <w:t xml:space="preserve"> </w:t>
-            </w:r>
-            <w:r>
-              <w:rPr>
-                <w:rFonts w:hint="eastAsia" w:ascii="宋体" w:hAnsi="宋体" w:eastAsia="宋体"/>
-                <w:b/>
-                <w:bCs/>
-                <w:sz w:val="20"/>
-              </w:rPr>
-              <w:t xml:space="preserve">第二站：秩序的世界——生活中有规律的数据（课本P41）</w:t>
-            </w:r>
-            <w:r>
-              <w:rPr>
-                <w:rFonts w:hint="eastAsia" w:ascii="宋体" w:hAnsi="宋体" w:eastAsia="宋体"/>
-                <w:sz w:val="20"/>
-              </w:rPr>
-              <w:t xml:space="preserve">：</w:t>
-            </w:r>
-            <w:r>
-              <w:rPr>
-                <w:rFonts w:ascii="宋体" w:hAnsi="宋体" w:eastAsia="宋体"/>
-                <w:sz w:val="20"/>
-              </w:rPr>
-              <w:br/>
-            </w:r>
-            <w:r>
-              <w:rPr>
-                <w:rFonts w:ascii="宋体" w:hAnsi="宋体" w:eastAsia="宋体"/>
-                <w:sz w:val="20"/>
-              </w:rPr>
-              <w:t xml:space="preserve">-</w:t>
-            </w:r>
-            <w:r>
-              <w:rPr>
-                <w:rFonts w:ascii="宋体" w:hAnsi="宋体" w:eastAsia="宋体"/>
-                <w:sz w:val="20"/>
-              </w:rPr>
-              <w:t xml:space="preserve"> </w:t>
-            </w:r>
-            <w:r>
-              <w:rPr>
-                <w:rFonts w:hint="eastAsia" w:ascii="宋体" w:hAnsi="宋体" w:eastAsia="宋体"/>
-                <w:b/>
-                <w:bCs/>
-                <w:sz w:val="20"/>
-              </w:rPr>
-              <w:t xml:space="preserve">观察生活中的规律数据</w:t>
-            </w:r>
-            <w:r>
-              <w:rPr>
-                <w:rFonts w:hint="eastAsia" w:ascii="宋体" w:hAnsi="宋体" w:eastAsia="宋体"/>
-                <w:sz w:val="20"/>
-              </w:rPr>
-              <w:t xml:space="preserve">：出示门牌号（5幢3单元201室）、班牌（三年级5班）、牛耳牌（052201）图片。</w:t>
-            </w:r>
-            <w:r>
-              <w:rPr>
-                <w:rFonts w:ascii="宋体" w:hAnsi="宋体" w:eastAsia="宋体"/>
-                <w:sz w:val="20"/>
-              </w:rPr>
-              <w:br/>
-            </w:r>
-            <w:r>
-              <w:rPr>
-                <w:rFonts w:ascii="宋体" w:hAnsi="宋体" w:eastAsia="宋体"/>
-                <w:sz w:val="20"/>
-              </w:rPr>
-              <w:t xml:space="preserve">-</w:t>
-            </w:r>
-            <w:r>
-              <w:rPr>
-                <w:rFonts w:ascii="宋体" w:hAnsi="宋体" w:eastAsia="宋体"/>
-                <w:sz w:val="20"/>
-              </w:rPr>
-              <w:t xml:space="preserve"> </w:t>
-            </w:r>
-            <w:r>
-              <w:rPr>
-                <w:rFonts w:hint="eastAsia" w:ascii="宋体" w:hAnsi="宋体" w:eastAsia="宋体"/>
-                <w:b/>
-                <w:bCs/>
-                <w:sz w:val="20"/>
-              </w:rPr>
-              <w:t xml:space="preserve">启发设问</w:t>
-            </w:r>
-            <w:r>
-              <w:rPr>
-                <w:rFonts w:hint="eastAsia" w:ascii="宋体" w:hAnsi="宋体" w:eastAsia="宋体"/>
-                <w:sz w:val="20"/>
-              </w:rPr>
-              <w:t xml:space="preserve">：“外卖员第一次来小区，为什么顺着‘5幢3单元201’能准确找到大门？牧场工人看‘052201’怎么知道是哪头奶牛？”</w:t>
-            </w:r>
-            <w:r>
-              <w:rPr>
-                <w:rFonts w:ascii="宋体" w:hAnsi="宋体" w:eastAsia="宋体"/>
-                <w:sz w:val="20"/>
-              </w:rPr>
-              <w:br/>
-            </w:r>
-            <w:r>
-              <w:rPr>
-                <w:rFonts w:ascii="宋体" w:hAnsi="宋体" w:eastAsia="宋体"/>
-                <w:sz w:val="20"/>
-              </w:rPr>
-              <w:t xml:space="preserve">-</w:t>
-            </w:r>
-            <w:r>
-              <w:rPr>
-                <w:rFonts w:ascii="宋体" w:hAnsi="宋体" w:eastAsia="宋体"/>
-                <w:sz w:val="20"/>
-              </w:rPr>
-              <w:t xml:space="preserve"> </w:t>
-            </w:r>
-            <w:r>
-              <w:rPr>
-                <w:rFonts w:hint="eastAsia" w:ascii="宋体" w:hAnsi="宋体" w:eastAsia="宋体"/>
-                <w:b/>
-                <w:bCs/>
-                <w:sz w:val="20"/>
-              </w:rPr>
-              <w:t xml:space="preserve">师生归纳</w:t>
-            </w:r>
-            <w:r>
-              <w:rPr>
-                <w:rFonts w:hint="eastAsia" w:ascii="宋体" w:hAnsi="宋体" w:eastAsia="宋体"/>
-                <w:sz w:val="20"/>
-              </w:rPr>
-              <w:t xml:space="preserve">：领会课本建构语：“身边存在许多有规律的数据，用来表达特定信息。数据编码已成为保持信息社会组织与秩序的科学基础。”</w:t>
-            </w:r>
-            <w:r>
-              <w:rPr>
-                <w:rFonts w:ascii="宋体" w:hAnsi="宋体" w:eastAsia="宋体"/>
-                <w:sz w:val="20"/>
-              </w:rPr>
-              <w:br/>
-            </w:r>
-            <w:r>
-              <w:rPr>
-                <w:rFonts w:ascii="宋体" w:hAnsi="宋体" w:eastAsia="宋体"/>
-                <w:sz w:val="20"/>
-              </w:rPr>
-              <w:br/>
-            </w:r>
-            <w:r>
-              <w:rPr>
-                <w:rFonts w:ascii="宋体" w:hAnsi="宋体" w:eastAsia="宋体"/>
-                <w:sz w:val="20"/>
-              </w:rPr>
-              <w:t xml:space="preserve">3.</w:t>
-            </w:r>
-            <w:r>
-              <w:rPr>
-                <w:rFonts w:ascii="宋体" w:hAnsi="宋体" w:eastAsia="宋体"/>
-                <w:sz w:val="20"/>
-              </w:rPr>
-              <w:t xml:space="preserve"> </w:t>
-            </w:r>
-            <w:r>
-              <w:rPr>
-                <w:rFonts w:hint="eastAsia" w:ascii="宋体" w:hAnsi="宋体" w:eastAsia="宋体"/>
-                <w:b/>
-                <w:bCs/>
-                <w:sz w:val="20"/>
-              </w:rPr>
-              <w:t xml:space="preserve">第三站：千姿百态——编码的呈现方式（课本P41~P42）</w:t>
-            </w:r>
-            <w:r>
-              <w:rPr>
-                <w:rFonts w:hint="eastAsia" w:ascii="宋体" w:hAnsi="宋体" w:eastAsia="宋体"/>
-                <w:sz w:val="20"/>
-              </w:rPr>
-              <w:t xml:space="preserve">：</w:t>
-            </w:r>
-            <w:r>
-              <w:rPr>
-                <w:rFonts w:ascii="宋体" w:hAnsi="宋体" w:eastAsia="宋体"/>
-                <w:sz w:val="20"/>
-              </w:rPr>
-              <w:br/>
-            </w:r>
-            <w:r>
-              <w:rPr>
-                <w:rFonts w:ascii="宋体" w:hAnsi="宋体" w:eastAsia="宋体"/>
-                <w:sz w:val="20"/>
-              </w:rPr>
-              <w:t xml:space="preserve">-</w:t>
-            </w:r>
-            <w:r>
-              <w:rPr>
-                <w:rFonts w:ascii="宋体" w:hAnsi="宋体" w:eastAsia="宋体"/>
-                <w:sz w:val="20"/>
-              </w:rPr>
-              <w:t xml:space="preserve"> </w:t>
-            </w:r>
-            <w:r>
-              <w:rPr>
-                <w:rFonts w:hint="eastAsia" w:ascii="宋体" w:hAnsi="宋体" w:eastAsia="宋体"/>
-                <w:b/>
-                <w:bCs/>
-                <w:sz w:val="20"/>
-              </w:rPr>
-              <w:t xml:space="preserve">归纳定义</w:t>
-            </w:r>
-            <w:r>
-              <w:rPr>
-                <w:rFonts w:hint="eastAsia" w:ascii="宋体" w:hAnsi="宋体" w:eastAsia="宋体"/>
-                <w:sz w:val="20"/>
-              </w:rPr>
-              <w:t xml:space="preserve">：“编码是按照约定规则进行的规范性描述，可以用数字、字母或文字等表示。”</w:t>
-            </w:r>
-            <w:r>
-              <w:rPr>
-                <w:rFonts w:ascii="宋体" w:hAnsi="宋体" w:eastAsia="宋体"/>
-                <w:sz w:val="20"/>
-              </w:rPr>
-              <w:br/>
-            </w:r>
-            <w:r>
-              <w:rPr>
-                <w:rFonts w:ascii="宋体" w:hAnsi="宋体" w:eastAsia="宋体"/>
-                <w:sz w:val="20"/>
-              </w:rPr>
-              <w:t xml:space="preserve">-</w:t>
-            </w:r>
-            <w:r>
-              <w:rPr>
-                <w:rFonts w:ascii="宋体" w:hAnsi="宋体" w:eastAsia="宋体"/>
-                <w:sz w:val="20"/>
-              </w:rPr>
-              <w:t xml:space="preserve"> </w:t>
-            </w:r>
-            <w:r>
-              <w:rPr>
-                <w:rFonts w:hint="eastAsia" w:ascii="宋体" w:hAnsi="宋体" w:eastAsia="宋体"/>
-                <w:b/>
-                <w:bCs/>
-                <w:sz w:val="20"/>
-              </w:rPr>
-              <w:t xml:space="preserve">四大呈现形态</w:t>
-            </w:r>
-            <w:r>
-              <w:rPr>
-                <w:rFonts w:hint="eastAsia" w:ascii="宋体" w:hAnsi="宋体" w:eastAsia="宋体"/>
-                <w:sz w:val="20"/>
-              </w:rPr>
-              <w:t xml:space="preserve">：</w:t>
-            </w:r>
-            <w:r>
-              <w:rPr>
-                <w:rFonts w:ascii="宋体" w:hAnsi="宋体" w:eastAsia="宋体"/>
-                <w:sz w:val="20"/>
-              </w:rPr>
-              <w:br/>
-            </w:r>
-            <w:r>
-              <w:rPr>
-                <w:rFonts w:ascii="宋体" w:hAnsi="宋体" w:eastAsia="宋体"/>
-                <w:sz w:val="20"/>
-              </w:rPr>
-              <w:t xml:space="preserve"> </w:t>
-            </w:r>
-            <w:r>
-              <w:rPr>
-                <w:rFonts w:ascii="宋体" w:hAnsi="宋体" w:eastAsia="宋体"/>
-                <w:sz w:val="20"/>
-              </w:rPr>
-              <w:t xml:space="preserve">①</w:t>
-            </w:r>
-            <w:r>
-              <w:rPr>
-                <w:rFonts w:ascii="宋体" w:hAnsi="宋体" w:eastAsia="宋体"/>
-                <w:sz w:val="20"/>
-              </w:rPr>
-              <w:t xml:space="preserve"> </w:t>
-            </w:r>
-            <w:r>
-              <w:rPr>
-                <w:rFonts w:hint="eastAsia" w:ascii="宋体" w:hAnsi="宋体" w:eastAsia="宋体"/>
-                <w:b/>
-                <w:bCs/>
-                <w:sz w:val="20"/>
-              </w:rPr>
-              <w:t xml:space="preserve">纯数字编码</w:t>
-            </w:r>
-            <w:r>
-              <w:rPr>
-                <w:rFonts w:hint="eastAsia" w:ascii="宋体" w:hAnsi="宋体" w:eastAsia="宋体"/>
-                <w:sz w:val="20"/>
-              </w:rPr>
-              <w:t xml:space="preserve">：11位手机号码，有序排列实现一对一精准通话；</w:t>
-            </w:r>
-            <w:r>
-              <w:rPr>
-                <w:rFonts w:ascii="宋体" w:hAnsi="宋体" w:eastAsia="宋体"/>
-                <w:sz w:val="20"/>
-              </w:rPr>
-              <w:br/>
-            </w:r>
-            <w:r>
-              <w:rPr>
-                <w:rFonts w:ascii="宋体" w:hAnsi="宋体" w:eastAsia="宋体"/>
-                <w:sz w:val="20"/>
-              </w:rPr>
-              <w:t xml:space="preserve"> </w:t>
-            </w:r>
-            <w:r>
-              <w:rPr>
-                <w:rFonts w:ascii="宋体" w:hAnsi="宋体" w:eastAsia="宋体"/>
-                <w:sz w:val="20"/>
-              </w:rPr>
-              <w:t xml:space="preserve">②</w:t>
-            </w:r>
-            <w:r>
-              <w:rPr>
-                <w:rFonts w:ascii="宋体" w:hAnsi="宋体" w:eastAsia="宋体"/>
-                <w:sz w:val="20"/>
-              </w:rPr>
-              <w:t xml:space="preserve"> </w:t>
-            </w:r>
-            <w:r>
-              <w:rPr>
-                <w:rFonts w:hint="eastAsia" w:ascii="宋体" w:hAnsi="宋体" w:eastAsia="宋体"/>
-                <w:b/>
-                <w:bCs/>
-                <w:sz w:val="20"/>
-              </w:rPr>
-              <w:t xml:space="preserve">图形编码（条形码/二维码）</w:t>
-            </w:r>
-            <w:r>
-              <w:rPr>
-                <w:rFonts w:hint="eastAsia" w:ascii="宋体" w:hAnsi="宋体" w:eastAsia="宋体"/>
-                <w:sz w:val="20"/>
-              </w:rPr>
-              <w:t xml:space="preserve">：超市条码（60323</w:t>
-            </w:r>
-            <w:r>
-              <w:rPr>
-                <w:rFonts w:ascii="宋体" w:hAnsi="宋体" w:eastAsia="宋体"/>
-                <w:sz w:val="20"/>
-              </w:rPr>
-              <w:t xml:space="preserve"> </w:t>
-            </w:r>
-            <w:r>
-              <w:rPr>
-                <w:rFonts w:hint="eastAsia" w:ascii="宋体" w:hAnsi="宋体" w:eastAsia="宋体"/>
-                <w:sz w:val="20"/>
-              </w:rPr>
-              <w:t xml:space="preserve">66320）。比喻：“条形码就像商品的斑马纹指纹名片，扫码枪一扫秒认名称价格！”</w:t>
-            </w:r>
-            <w:r>
-              <w:rPr>
-                <w:rFonts w:ascii="宋体" w:hAnsi="宋体" w:eastAsia="宋体"/>
-                <w:sz w:val="20"/>
-              </w:rPr>
-              <w:br/>
-            </w:r>
-            <w:r>
-              <w:rPr>
-                <w:rFonts w:ascii="宋体" w:hAnsi="宋体" w:eastAsia="宋体"/>
-                <w:sz w:val="20"/>
-              </w:rPr>
-              <w:t xml:space="preserve"> </w:t>
-            </w:r>
-            <w:r>
-              <w:rPr>
-                <w:rFonts w:ascii="宋体" w:hAnsi="宋体" w:eastAsia="宋体"/>
-                <w:sz w:val="20"/>
-              </w:rPr>
-              <w:t xml:space="preserve">③</w:t>
-            </w:r>
-            <w:r>
-              <w:rPr>
-                <w:rFonts w:ascii="宋体" w:hAnsi="宋体" w:eastAsia="宋体"/>
-                <w:sz w:val="20"/>
-              </w:rPr>
-              <w:t xml:space="preserve"> </w:t>
-            </w:r>
-            <w:r>
-              <w:rPr>
-                <w:rFonts w:hint="eastAsia" w:ascii="宋体" w:hAnsi="宋体" w:eastAsia="宋体"/>
-                <w:b/>
-                <w:bCs/>
-                <w:sz w:val="20"/>
-              </w:rPr>
-              <w:t xml:space="preserve">经纬度空间编码</w:t>
-            </w:r>
-            <w:r>
-              <w:rPr>
-                <w:rFonts w:hint="eastAsia" w:ascii="宋体" w:hAnsi="宋体" w:eastAsia="宋体"/>
-                <w:sz w:val="20"/>
-              </w:rPr>
-              <w:t xml:space="preserve">：四大盆地经纬网图，利用经纬两条坐标线锁定地球任意位置；</w:t>
-            </w:r>
-            <w:r>
-              <w:rPr>
-                <w:rFonts w:ascii="宋体" w:hAnsi="宋体" w:eastAsia="宋体"/>
-                <w:sz w:val="20"/>
-              </w:rPr>
-              <w:br/>
-            </w:r>
-            <w:r>
-              <w:rPr>
-                <w:rFonts w:ascii="宋体" w:hAnsi="宋体" w:eastAsia="宋体"/>
-                <w:sz w:val="20"/>
-              </w:rPr>
-              <w:t xml:space="preserve"> </w:t>
-            </w:r>
-            <w:r>
-              <w:rPr>
-                <w:rFonts w:ascii="宋体" w:hAnsi="宋体" w:eastAsia="宋体"/>
-                <w:sz w:val="20"/>
-              </w:rPr>
-              <w:t xml:space="preserve">④</w:t>
-            </w:r>
-            <w:r>
-              <w:rPr>
-                <w:rFonts w:ascii="宋体" w:hAnsi="宋体" w:eastAsia="宋体"/>
-                <w:sz w:val="20"/>
-              </w:rPr>
-              <w:t xml:space="preserve"> </w:t>
-            </w:r>
-            <w:r>
-              <w:rPr>
-                <w:rFonts w:hint="eastAsia" w:ascii="宋体" w:hAnsi="宋体" w:eastAsia="宋体"/>
-                <w:b/>
-                <w:bCs/>
-                <w:sz w:val="20"/>
-              </w:rPr>
-              <w:t xml:space="preserve">混合编码（课本P42拓展）</w:t>
-            </w:r>
-            <w:r>
-              <w:rPr>
-                <w:rFonts w:hint="eastAsia" w:ascii="宋体" w:hAnsi="宋体" w:eastAsia="宋体"/>
-                <w:sz w:val="20"/>
-              </w:rPr>
-              <w:t xml:space="preserve">：地铁3号线车门铭牌“521</w:t>
-            </w:r>
-            <w:r>
-              <w:rPr>
-                <w:rFonts w:ascii="宋体" w:hAnsi="宋体" w:eastAsia="宋体"/>
-                <w:sz w:val="20"/>
-              </w:rPr>
-              <w:t xml:space="preserve"> 2B”。</w:t>
-            </w:r>
-            <w:r>
-              <w:rPr>
-                <w:rFonts w:ascii="宋体" w:hAnsi="宋体" w:eastAsia="宋体"/>
-                <w:sz w:val="20"/>
-              </w:rPr>
-              <w:br/>
-            </w:r>
-            <w:r>
-              <w:rPr>
-                <w:rFonts w:ascii="宋体" w:hAnsi="宋体" w:eastAsia="宋体"/>
-                <w:sz w:val="20"/>
-              </w:rPr>
-              <w:t xml:space="preserve">-</w:t>
-            </w:r>
-            <w:r>
-              <w:rPr>
-                <w:rFonts w:ascii="宋体" w:hAnsi="宋体" w:eastAsia="宋体"/>
-                <w:sz w:val="20"/>
-              </w:rPr>
-              <w:t xml:space="preserve"> </w:t>
-            </w:r>
-            <w:r>
-              <w:rPr>
-                <w:rFonts w:hint="eastAsia" w:ascii="宋体" w:hAnsi="宋体" w:eastAsia="宋体"/>
-                <w:b/>
-                <w:bCs/>
-                <w:sz w:val="20"/>
-              </w:rPr>
-              <w:t xml:space="preserve">破译小侦探现场拆解</w:t>
-            </w:r>
-            <w:r>
-              <w:rPr>
-                <w:rFonts w:hint="eastAsia" w:ascii="宋体" w:hAnsi="宋体" w:eastAsia="宋体"/>
-                <w:sz w:val="20"/>
-              </w:rPr>
-              <w:t xml:space="preserve">：</w:t>
-            </w:r>
-            <w:r>
-              <w:rPr>
-                <w:rFonts w:ascii="宋体" w:hAnsi="宋体" w:eastAsia="宋体"/>
-                <w:sz w:val="20"/>
-              </w:rPr>
-              <w:br/>
-            </w:r>
-            <w:r>
-              <w:rPr>
-                <w:rFonts w:ascii="宋体" w:hAnsi="宋体" w:eastAsia="宋体"/>
-                <w:sz w:val="20"/>
-              </w:rPr>
-              <w:t xml:space="preserve"> </w:t>
-            </w:r>
-            <w:r>
-              <w:rPr>
-                <w:rFonts w:ascii="宋体" w:hAnsi="宋体" w:eastAsia="宋体"/>
-                <w:sz w:val="20"/>
-              </w:rPr>
-              <w:t xml:space="preserve">· </w:t>
-            </w:r>
-            <w:r>
-              <w:rPr>
-                <w:rFonts w:hint="eastAsia" w:ascii="宋体" w:hAnsi="宋体" w:eastAsia="宋体"/>
-                <w:sz w:val="20"/>
-              </w:rPr>
-              <w:t xml:space="preserve">教师追问：“521</w:t>
-            </w:r>
-            <w:r>
-              <w:rPr>
-                <w:rFonts w:ascii="宋体" w:hAnsi="宋体" w:eastAsia="宋体"/>
-                <w:sz w:val="20"/>
-              </w:rPr>
-              <w:t xml:space="preserve"> </w:t>
-            </w:r>
-            <w:r>
-              <w:rPr>
-                <w:rFonts w:hint="eastAsia" w:ascii="宋体" w:hAnsi="宋体" w:eastAsia="宋体"/>
-                <w:sz w:val="20"/>
-              </w:rPr>
-              <w:t xml:space="preserve">2B检修工怎么看懂？”师生拆解：52表示第52列车，1表示1号车厢，2表示2号门，B表示右门扇（A是左门扇）。出现故障时检修工能精准直达！</w:t>
+              <w:t xml:space="preserve">指导完成导学单第一关</w:t>
+            </w:r>
+            <w:r>
+              <w:rPr>
+                <w:rFonts w:hint="eastAsia" w:ascii="宋体" w:hAnsi="宋体" w:eastAsia="宋体"/>
+                <w:sz w:val="20"/>
+              </w:rPr>
+              <w:t xml:space="preserve">：补齐周雨欣学号（20220402）。</w:t>
             </w:r>
           </w:p>
         </w:tc>
@@ -2003,7 +1355,7 @@
                 <w:rFonts w:hint="eastAsia" w:ascii="宋体" w:hAnsi="宋体" w:eastAsia="宋体"/>
                 <w:sz w:val="20"/>
               </w:rPr>
-              <w:t xml:space="preserve">观察学号表，发现各段数字与学生信息的对应规律。</w:t>
+              <w:t xml:space="preserve">拆解学号字段为“年份(4位)+班级(2位)+排序(2位)”。</w:t>
             </w:r>
             <w:r>
               <w:rPr>
@@ -2024,35 +1376,7 @@
                 <w:rFonts w:hint="eastAsia" w:ascii="宋体" w:hAnsi="宋体" w:eastAsia="宋体"/>
                 <w:sz w:val="20"/>
               </w:rPr>
-              <w:t xml:space="preserve">举手拆解学号为“2022（年份）+</w:t>
-            </w:r>
-            <w:r>
-              <w:rPr>
-                <w:rFonts w:ascii="宋体" w:hAnsi="宋体" w:eastAsia="宋体"/>
-                <w:sz w:val="20"/>
-              </w:rPr>
-              <w:t xml:space="preserve"> </w:t>
-            </w:r>
-            <w:r>
-              <w:rPr>
-                <w:rFonts w:hint="eastAsia" w:ascii="宋体" w:hAnsi="宋体" w:eastAsia="宋体"/>
-                <w:sz w:val="20"/>
-              </w:rPr>
-              <w:t xml:space="preserve">03（班级）+</w:t>
-            </w:r>
-            <w:r>
-              <w:rPr>
-                <w:rFonts w:ascii="宋体" w:hAnsi="宋体" w:eastAsia="宋体"/>
-                <w:sz w:val="20"/>
-              </w:rPr>
-              <w:t xml:space="preserve"> </w:t>
-            </w:r>
-            <w:r>
-              <w:rPr>
-                <w:rFonts w:hint="eastAsia" w:ascii="宋体" w:hAnsi="宋体" w:eastAsia="宋体"/>
-                <w:sz w:val="20"/>
-              </w:rPr>
-              <w:t xml:space="preserve">39（出生排序）”。</w:t>
+              <w:t xml:space="preserve">领会积木卡扣比喻与补零规范。</w:t>
             </w:r>
             <w:r>
               <w:rPr>
@@ -2073,84 +1397,7 @@
                 <w:rFonts w:hint="eastAsia" w:ascii="宋体" w:hAnsi="宋体" w:eastAsia="宋体"/>
                 <w:sz w:val="20"/>
               </w:rPr>
-              <w:t xml:space="preserve">倾听积木比喻与补零提示，理解统一位数的必要性，在导学单填写周雨欣学号“20220402”。</w:t>
-            </w:r>
-            <w:r>
-              <w:rPr>
-                <w:rFonts w:ascii="宋体" w:hAnsi="宋体" w:eastAsia="宋体"/>
-                <w:sz w:val="20"/>
-              </w:rPr>
-              <w:br/>
-            </w:r>
-            <w:r>
-              <w:rPr>
-                <w:rFonts w:ascii="宋体" w:hAnsi="宋体" w:eastAsia="宋体"/>
-                <w:sz w:val="20"/>
-              </w:rPr>
-              <w:t xml:space="preserve">4. </w:t>
-            </w:r>
-            <w:r>
-              <w:rPr>
-                <w:rFonts w:hint="eastAsia" w:ascii="宋体" w:hAnsi="宋体" w:eastAsia="宋体"/>
-                <w:sz w:val="20"/>
-              </w:rPr>
-              <w:t xml:space="preserve">观察门牌、班牌与牛耳牌，体会“编码保持世界秩序”的含义。</w:t>
-            </w:r>
-            <w:r>
-              <w:rPr>
-                <w:rFonts w:ascii="宋体" w:hAnsi="宋体" w:eastAsia="宋体"/>
-                <w:sz w:val="20"/>
-              </w:rPr>
-              <w:br/>
-            </w:r>
-            <w:r>
-              <w:rPr>
-                <w:rFonts w:ascii="宋体" w:hAnsi="宋体" w:eastAsia="宋体"/>
-                <w:sz w:val="20"/>
-              </w:rPr>
-              <w:t xml:space="preserve">5. </w:t>
-            </w:r>
-            <w:r>
-              <w:rPr>
-                <w:rFonts w:hint="eastAsia" w:ascii="宋体" w:hAnsi="宋体" w:eastAsia="宋体"/>
-                <w:sz w:val="20"/>
-              </w:rPr>
-              <w:t xml:space="preserve">认识数字、图形条码、经纬度与车门混合编码。</w:t>
-            </w:r>
-            <w:r>
-              <w:rPr>
-                <w:rFonts w:ascii="宋体" w:hAnsi="宋体" w:eastAsia="宋体"/>
-                <w:sz w:val="20"/>
-              </w:rPr>
-              <w:br/>
-            </w:r>
-            <w:r>
-              <w:rPr>
-                <w:rFonts w:ascii="宋体" w:hAnsi="宋体" w:eastAsia="宋体"/>
-                <w:sz w:val="20"/>
-              </w:rPr>
-              <w:t xml:space="preserve">6. </w:t>
-            </w:r>
-            <w:r>
-              <w:rPr>
-                <w:rFonts w:hint="eastAsia" w:ascii="宋体" w:hAnsi="宋体" w:eastAsia="宋体"/>
-                <w:sz w:val="20"/>
-              </w:rPr>
-              <w:t xml:space="preserve">破译“521</w:t>
-            </w:r>
-            <w:r>
-              <w:rPr>
-                <w:rFonts w:ascii="宋体" w:hAnsi="宋体" w:eastAsia="宋体"/>
-                <w:sz w:val="20"/>
-              </w:rPr>
-              <w:t xml:space="preserve"> </w:t>
-            </w:r>
-            <w:r>
-              <w:rPr>
-                <w:rFonts w:hint="eastAsia" w:ascii="宋体" w:hAnsi="宋体" w:eastAsia="宋体"/>
-                <w:sz w:val="20"/>
-              </w:rPr>
-              <w:t xml:space="preserve">2B”对应的列车、车厢、门位与门扇信息。</w:t>
+              <w:t xml:space="preserve">独立完成导学单第一关学号填写，同桌互核。</w:t>
             </w:r>
           </w:p>
         </w:tc>
@@ -2170,7 +1417,7 @@
                 <w:rFonts w:hint="eastAsia" w:ascii="宋体" w:hAnsi="宋体" w:eastAsia="宋体"/>
                 <w:sz w:val="20"/>
               </w:rPr>
-              <w:t xml:space="preserve">从具体到抽象，依托学号表突破教学难点；融入比喻与补零预警避开常见盲区；覆盖课本四大呈现形态与地铁车门拓展，打通生活与课堂。</w:t>
+              <w:t xml:space="preserve">借助学号具体案例突破编码规则抽象难点，强化规范意识。</w:t>
             </w:r>
           </w:p>
         </w:tc>
@@ -2195,7 +1442,39 @@
                 <w:bCs/>
                 <w:sz w:val="20"/>
               </w:rPr>
-              <w:t xml:space="preserve">动手练习</w:t>
+              <w:t xml:space="preserve">三、放眼生活</w:t>
+            </w:r>
+            <w:r>
+              <w:rPr>
+                <w:rFonts w:ascii="宋体" w:hAnsi="宋体" w:eastAsia="宋体"/>
+                <w:sz w:val="20"/>
+              </w:rPr>
+              <w:br/>
+            </w:r>
+            <w:r>
+              <w:rPr>
+                <w:rFonts w:hint="eastAsia" w:ascii="宋体" w:hAnsi="宋体" w:eastAsia="宋体"/>
+                <w:b/>
+                <w:bCs/>
+                <w:sz w:val="20"/>
+              </w:rPr>
+              <w:t xml:space="preserve">编码呈现方式</w:t>
+            </w:r>
+            <w:r>
+              <w:rPr>
+                <w:rFonts w:ascii="宋体" w:hAnsi="宋体" w:eastAsia="宋体"/>
+                <w:sz w:val="20"/>
+              </w:rPr>
+              <w:br/>
+            </w:r>
+            <w:r>
+              <w:rPr>
+                <w:rFonts w:hint="eastAsia" w:ascii="宋体" w:hAnsi="宋体" w:eastAsia="宋体"/>
+                <w:b/>
+                <w:bCs/>
+                <w:sz w:val="20"/>
+              </w:rPr>
+              <w:t xml:space="preserve">(9分钟)</w:t>
             </w:r>
           </w:p>
         </w:tc>
@@ -2231,14 +1510,14 @@
                 <w:bCs/>
                 <w:sz w:val="20"/>
               </w:rPr>
-              <w:t xml:space="preserve">实操一：导学单笔尖大闯关（纸笔留痕）</w:t>
-            </w:r>
-            <w:r>
-              <w:rPr>
-                <w:rFonts w:hint="eastAsia" w:ascii="宋体" w:hAnsi="宋体" w:eastAsia="宋体"/>
-                <w:sz w:val="20"/>
-              </w:rPr>
-              <w:t xml:space="preserve">：</w:t>
+              <w:t xml:space="preserve">展示生活秩序实例</w:t>
+            </w:r>
+            <w:r>
+              <w:rPr>
+                <w:rFonts w:hint="eastAsia" w:ascii="宋体" w:hAnsi="宋体" w:eastAsia="宋体"/>
+                <w:sz w:val="20"/>
+              </w:rPr>
+              <w:t xml:space="preserve">：出示门牌号、班牌、牛耳牌图片，体会“数据编码是保持社会秩序的科学基础”。</w:t>
             </w:r>
             <w:r>
               <w:rPr>
@@ -2252,98 +1531,7 @@
                 <w:rFonts w:ascii="宋体" w:hAnsi="宋体" w:eastAsia="宋体"/>
                 <w:sz w:val="20"/>
               </w:rPr>
-              <w:t xml:space="preserve">- </w:t>
-            </w:r>
-            <w:r>
-              <w:rPr>
-                <w:rFonts w:hint="eastAsia" w:ascii="宋体" w:hAnsi="宋体" w:eastAsia="宋体"/>
-                <w:sz w:val="20"/>
-              </w:rPr>
-              <w:t xml:space="preserve">教师组织学生限时3分钟高效完成课堂导学单第二关与第三关：</w:t>
-            </w:r>
-            <w:r>
-              <w:rPr>
-                <w:rFonts w:ascii="宋体" w:hAnsi="宋体" w:eastAsia="宋体"/>
-                <w:sz w:val="20"/>
-              </w:rPr>
-              <w:br/>
-            </w:r>
-            <w:r>
-              <w:rPr>
-                <w:rFonts w:ascii="宋体" w:hAnsi="宋体" w:eastAsia="宋体"/>
-                <w:sz w:val="20"/>
-              </w:rPr>
-              <w:t xml:space="preserve"> </w:t>
-            </w:r>
-            <w:r>
-              <w:rPr>
-                <w:rFonts w:ascii="宋体" w:hAnsi="宋体" w:eastAsia="宋体"/>
-                <w:sz w:val="20"/>
-              </w:rPr>
-              <w:t xml:space="preserve">· </w:t>
-            </w:r>
-            <w:r>
-              <w:rPr>
-                <w:rFonts w:hint="eastAsia" w:ascii="宋体" w:hAnsi="宋体" w:eastAsia="宋体"/>
-                <w:sz w:val="20"/>
-              </w:rPr>
-              <w:t xml:space="preserve">第二关【火眼金睛连连看】：完成手机号、超市条码、盆地坐标、地铁车门与呈现方式的连线；</w:t>
-            </w:r>
-            <w:r>
-              <w:rPr>
-                <w:rFonts w:ascii="宋体" w:hAnsi="宋体" w:eastAsia="宋体"/>
-                <w:sz w:val="20"/>
-              </w:rPr>
-              <w:br/>
-            </w:r>
-            <w:r>
-              <w:rPr>
-                <w:rFonts w:ascii="宋体" w:hAnsi="宋体" w:eastAsia="宋体"/>
-                <w:sz w:val="20"/>
-              </w:rPr>
-              <w:t xml:space="preserve"> </w:t>
-            </w:r>
-            <w:r>
-              <w:rPr>
-                <w:rFonts w:ascii="宋体" w:hAnsi="宋体" w:eastAsia="宋体"/>
-                <w:sz w:val="20"/>
-              </w:rPr>
-              <w:t xml:space="preserve">· </w:t>
-            </w:r>
-            <w:r>
-              <w:rPr>
-                <w:rFonts w:hint="eastAsia" w:ascii="宋体" w:hAnsi="宋体" w:eastAsia="宋体"/>
-                <w:sz w:val="20"/>
-              </w:rPr>
-              <w:t xml:space="preserve">第三关【破译小侦探】：工整书写地铁车门521</w:t>
-            </w:r>
-            <w:r>
-              <w:rPr>
-                <w:rFonts w:ascii="宋体" w:hAnsi="宋体" w:eastAsia="宋体"/>
-                <w:sz w:val="20"/>
-              </w:rPr>
-              <w:t xml:space="preserve"> </w:t>
-            </w:r>
-            <w:r>
-              <w:rPr>
-                <w:rFonts w:hint="eastAsia" w:ascii="宋体" w:hAnsi="宋体" w:eastAsia="宋体"/>
-                <w:sz w:val="20"/>
-              </w:rPr>
-              <w:t xml:space="preserve">2B各段代表的具体意义。</w:t>
-            </w:r>
-            <w:r>
-              <w:rPr>
-                <w:rFonts w:ascii="宋体" w:hAnsi="宋体" w:eastAsia="宋体"/>
-                <w:sz w:val="20"/>
-              </w:rPr>
-              <w:br/>
-            </w:r>
-            <w:r>
-              <w:rPr>
-                <w:rFonts w:ascii="宋体" w:hAnsi="宋体" w:eastAsia="宋体"/>
-                <w:sz w:val="20"/>
-              </w:rPr>
-              <w:t xml:space="preserve">-</w:t>
+              <w:t xml:space="preserve">2.</w:t>
             </w:r>
             <w:r>
               <w:rPr>
@@ -2359,7 +1547,7 @@
                 <w:bCs/>
                 <w:sz w:val="20"/>
               </w:rPr>
-              <w:t xml:space="preserve">巡视指导锦囊</w:t>
+              <w:t xml:space="preserve">拆解四大呈现方式</w:t>
             </w:r>
             <w:r>
               <w:rPr>
@@ -2380,21 +1568,14 @@
                 <w:rFonts w:ascii="宋体" w:hAnsi="宋体" w:eastAsia="宋体"/>
                 <w:sz w:val="20"/>
               </w:rPr>
-              <w:t xml:space="preserve"> </w:t>
-            </w:r>
-            <w:r>
-              <w:rPr>
-                <w:rFonts w:ascii="宋体" w:hAnsi="宋体" w:eastAsia="宋体"/>
-                <w:sz w:val="20"/>
-              </w:rPr>
-              <w:t xml:space="preserve">· </w:t>
-            </w:r>
-            <w:r>
-              <w:rPr>
-                <w:rFonts w:hint="eastAsia" w:ascii="宋体" w:hAnsi="宋体" w:eastAsia="宋体"/>
-                <w:sz w:val="20"/>
-              </w:rPr>
-              <w:t xml:space="preserve">巡视过道，重点观察学生在填写门扇字母时是否混淆“A为左扇、B为右扇”；</w:t>
+              <w:t xml:space="preserve">- </w:t>
+            </w:r>
+            <w:r>
+              <w:rPr>
+                <w:rFonts w:hint="eastAsia" w:ascii="宋体" w:hAnsi="宋体" w:eastAsia="宋体"/>
+                <w:sz w:val="20"/>
+              </w:rPr>
+              <w:t xml:space="preserve">纯数字编码：11位手机号；</w:t>
             </w:r>
             <w:r>
               <w:rPr>
@@ -2408,21 +1589,14 @@
                 <w:rFonts w:ascii="宋体" w:hAnsi="宋体" w:eastAsia="宋体"/>
                 <w:sz w:val="20"/>
               </w:rPr>
-              <w:t xml:space="preserve"> </w:t>
-            </w:r>
-            <w:r>
-              <w:rPr>
-                <w:rFonts w:ascii="宋体" w:hAnsi="宋体" w:eastAsia="宋体"/>
-                <w:sz w:val="20"/>
-              </w:rPr>
-              <w:t xml:space="preserve">· </w:t>
-            </w:r>
-            <w:r>
-              <w:rPr>
-                <w:rFonts w:hint="eastAsia" w:ascii="宋体" w:hAnsi="宋体" w:eastAsia="宋体"/>
-                <w:sz w:val="20"/>
-              </w:rPr>
-              <w:t xml:space="preserve">关注字迹工整度，对完成快速准确的同学给予鼓励。</w:t>
+              <w:t xml:space="preserve">- </w:t>
+            </w:r>
+            <w:r>
+              <w:rPr>
+                <w:rFonts w:hint="eastAsia" w:ascii="宋体" w:hAnsi="宋体" w:eastAsia="宋体"/>
+                <w:sz w:val="20"/>
+              </w:rPr>
+              <w:t xml:space="preserve">图形编码：超市条形码（比作商品的斑马纹指纹）；</w:t>
             </w:r>
             <w:r>
               <w:rPr>
@@ -2436,6 +1610,20 @@
                 <w:rFonts w:ascii="宋体" w:hAnsi="宋体" w:eastAsia="宋体"/>
                 <w:sz w:val="20"/>
               </w:rPr>
+              <w:t xml:space="preserve">- </w:t>
+            </w:r>
+            <w:r>
+              <w:rPr>
+                <w:rFonts w:hint="eastAsia" w:ascii="宋体" w:hAnsi="宋体" w:eastAsia="宋体"/>
+                <w:sz w:val="20"/>
+              </w:rPr>
+              <w:t xml:space="preserve">空间编码：四大盆地经纬网；</w:t>
+            </w:r>
+            <w:r>
+              <w:rPr>
+                <w:rFonts w:ascii="宋体" w:hAnsi="宋体" w:eastAsia="宋体"/>
+                <w:sz w:val="20"/>
+              </w:rPr>
               <w:br/>
             </w:r>
             <w:r>
@@ -2443,7 +1631,35 @@
                 <w:rFonts w:ascii="宋体" w:hAnsi="宋体" w:eastAsia="宋体"/>
                 <w:sz w:val="20"/>
               </w:rPr>
-              <w:t xml:space="preserve">2.</w:t>
+              <w:t xml:space="preserve">- </w:t>
+            </w:r>
+            <w:r>
+              <w:rPr>
+                <w:rFonts w:hint="eastAsia" w:ascii="宋体" w:hAnsi="宋体" w:eastAsia="宋体"/>
+                <w:sz w:val="20"/>
+              </w:rPr>
+              <w:t xml:space="preserve">混合编码：地铁3号线车门铭牌“521</w:t>
+            </w:r>
+            <w:r>
+              <w:rPr>
+                <w:rFonts w:ascii="宋体" w:hAnsi="宋体" w:eastAsia="宋体"/>
+                <w:sz w:val="20"/>
+              </w:rPr>
+              <w:t xml:space="preserve"> 2B”。</w:t>
+            </w:r>
+            <w:r>
+              <w:rPr>
+                <w:rFonts w:ascii="宋体" w:hAnsi="宋体" w:eastAsia="宋体"/>
+                <w:sz w:val="20"/>
+              </w:rPr>
+              <w:br/>
+            </w:r>
+            <w:r>
+              <w:rPr>
+                <w:rFonts w:ascii="宋体" w:hAnsi="宋体" w:eastAsia="宋体"/>
+                <w:sz w:val="20"/>
+              </w:rPr>
+              <w:t xml:space="preserve">3.</w:t>
             </w:r>
             <w:r>
               <w:rPr>
@@ -2459,14 +1675,14 @@
                 <w:bCs/>
                 <w:sz w:val="20"/>
               </w:rPr>
-              <w:t xml:space="preserve">实操二：数字化随堂作业互动实训（上机模拟）</w:t>
-            </w:r>
-            <w:r>
-              <w:rPr>
-                <w:rFonts w:hint="eastAsia" w:ascii="宋体" w:hAnsi="宋体" w:eastAsia="宋体"/>
-                <w:sz w:val="20"/>
-              </w:rPr>
-              <w:t xml:space="preserve">：</w:t>
+              <w:t xml:space="preserve">破译小侦探现场拆解</w:t>
+            </w:r>
+            <w:r>
+              <w:rPr>
+                <w:rFonts w:hint="eastAsia" w:ascii="宋体" w:hAnsi="宋体" w:eastAsia="宋体"/>
+                <w:sz w:val="20"/>
+              </w:rPr>
+              <w:t xml:space="preserve">：52（列车）+1（车厢）+2（车门）+B（右门扇）。</w:t>
             </w:r>
             <w:r>
               <w:rPr>
@@ -2480,63 +1696,7 @@
                 <w:rFonts w:ascii="宋体" w:hAnsi="宋体" w:eastAsia="宋体"/>
                 <w:sz w:val="20"/>
               </w:rPr>
-              <w:t xml:space="preserve">- </w:t>
-            </w:r>
-            <w:r>
-              <w:rPr>
-                <w:rFonts w:hint="eastAsia" w:ascii="宋体" w:hAnsi="宋体" w:eastAsia="宋体"/>
-                <w:sz w:val="20"/>
-              </w:rPr>
-              <w:t xml:space="preserve">指导学生双击打开桌面《第10课</w:t>
-            </w:r>
-            <w:r>
-              <w:rPr>
-                <w:rFonts w:ascii="宋体" w:hAnsi="宋体" w:eastAsia="宋体"/>
-                <w:sz w:val="20"/>
-              </w:rPr>
-              <w:t xml:space="preserve"> </w:t>
-            </w:r>
-            <w:r>
-              <w:rPr>
-                <w:rFonts w:hint="eastAsia" w:ascii="宋体" w:hAnsi="宋体" w:eastAsia="宋体"/>
-                <w:sz w:val="20"/>
-              </w:rPr>
-              <w:t xml:space="preserve">从数据到编码</w:t>
-            </w:r>
-            <w:r>
-              <w:rPr>
-                <w:rFonts w:ascii="宋体" w:hAnsi="宋体" w:eastAsia="宋体"/>
-                <w:sz w:val="20"/>
-              </w:rPr>
-              <w:t xml:space="preserve"> · </w:t>
-            </w:r>
-            <w:r>
-              <w:rPr>
-                <w:rFonts w:hint="eastAsia" w:ascii="宋体" w:hAnsi="宋体" w:eastAsia="宋体"/>
-                <w:sz w:val="20"/>
-              </w:rPr>
-              <w:t xml:space="preserve">课堂作业.html》：</w:t>
-            </w:r>
-            <w:r>
-              <w:rPr>
-                <w:rFonts w:ascii="宋体" w:hAnsi="宋体" w:eastAsia="宋体"/>
-                <w:sz w:val="20"/>
-              </w:rPr>
-              <w:br/>
-            </w:r>
-            <w:r>
-              <w:rPr>
-                <w:rFonts w:ascii="宋体" w:hAnsi="宋体" w:eastAsia="宋体"/>
-                <w:sz w:val="20"/>
-              </w:rPr>
-              <w:t xml:space="preserve"> </w:t>
-            </w:r>
-            <w:r>
-              <w:rPr>
-                <w:rFonts w:ascii="宋体" w:hAnsi="宋体" w:eastAsia="宋体"/>
-                <w:sz w:val="20"/>
-              </w:rPr>
-              <w:t xml:space="preserve">·</w:t>
+              <w:t xml:space="preserve">4.</w:t>
             </w:r>
             <w:r>
               <w:rPr>
@@ -2552,181 +1712,14 @@
                 <w:bCs/>
                 <w:sz w:val="20"/>
               </w:rPr>
-              <w:t xml:space="preserve">第一屏【学号规律】</w:t>
-            </w:r>
-            <w:r>
-              <w:rPr>
-                <w:rFonts w:hint="eastAsia" w:ascii="宋体" w:hAnsi="宋体" w:eastAsia="宋体"/>
-                <w:sz w:val="20"/>
-              </w:rPr>
-              <w:t xml:space="preserve">：点击拼装学号积木，验证周雨欣学号生成逻辑；</w:t>
-            </w:r>
-            <w:r>
-              <w:rPr>
-                <w:rFonts w:ascii="宋体" w:hAnsi="宋体" w:eastAsia="宋体"/>
-                <w:sz w:val="20"/>
-              </w:rPr>
-              <w:br/>
-            </w:r>
-            <w:r>
-              <w:rPr>
-                <w:rFonts w:ascii="宋体" w:hAnsi="宋体" w:eastAsia="宋体"/>
-                <w:sz w:val="20"/>
-              </w:rPr>
-              <w:t xml:space="preserve"> </w:t>
-            </w:r>
-            <w:r>
-              <w:rPr>
-                <w:rFonts w:ascii="宋体" w:hAnsi="宋体" w:eastAsia="宋体"/>
-                <w:sz w:val="20"/>
-              </w:rPr>
-              <w:t xml:space="preserve">·</w:t>
-            </w:r>
-            <w:r>
-              <w:rPr>
-                <w:rFonts w:ascii="宋体" w:hAnsi="宋体" w:eastAsia="宋体"/>
-                <w:sz w:val="20"/>
-              </w:rPr>
-              <w:t xml:space="preserve"> </w:t>
-            </w:r>
-            <w:r>
-              <w:rPr>
-                <w:rFonts w:hint="eastAsia" w:ascii="宋体" w:hAnsi="宋体" w:eastAsia="宋体"/>
-                <w:b/>
-                <w:bCs/>
-                <w:sz w:val="20"/>
-              </w:rPr>
-              <w:t xml:space="preserve">第二屏【呈现方式】</w:t>
-            </w:r>
-            <w:r>
-              <w:rPr>
-                <w:rFonts w:hint="eastAsia" w:ascii="宋体" w:hAnsi="宋体" w:eastAsia="宋体"/>
-                <w:sz w:val="20"/>
-              </w:rPr>
-              <w:t xml:space="preserve">：卡片点选配对，挑战编码家族趣味对对碰；</w:t>
-            </w:r>
-            <w:r>
-              <w:rPr>
-                <w:rFonts w:ascii="宋体" w:hAnsi="宋体" w:eastAsia="宋体"/>
-                <w:sz w:val="20"/>
-              </w:rPr>
-              <w:br/>
-            </w:r>
-            <w:r>
-              <w:rPr>
-                <w:rFonts w:ascii="宋体" w:hAnsi="宋体" w:eastAsia="宋体"/>
-                <w:sz w:val="20"/>
-              </w:rPr>
-              <w:t xml:space="preserve"> </w:t>
-            </w:r>
-            <w:r>
-              <w:rPr>
-                <w:rFonts w:ascii="宋体" w:hAnsi="宋体" w:eastAsia="宋体"/>
-                <w:sz w:val="20"/>
-              </w:rPr>
-              <w:t xml:space="preserve">·</w:t>
-            </w:r>
-            <w:r>
-              <w:rPr>
-                <w:rFonts w:ascii="宋体" w:hAnsi="宋体" w:eastAsia="宋体"/>
-                <w:sz w:val="20"/>
-              </w:rPr>
-              <w:t xml:space="preserve"> </w:t>
-            </w:r>
-            <w:r>
-              <w:rPr>
-                <w:rFonts w:hint="eastAsia" w:ascii="宋体" w:hAnsi="宋体" w:eastAsia="宋体"/>
-                <w:b/>
-                <w:bCs/>
-                <w:sz w:val="20"/>
-              </w:rPr>
-              <w:t xml:space="preserve">第三屏【车门破译】</w:t>
-            </w:r>
-            <w:r>
-              <w:rPr>
-                <w:rFonts w:hint="eastAsia" w:ascii="宋体" w:hAnsi="宋体" w:eastAsia="宋体"/>
-                <w:sz w:val="20"/>
-              </w:rPr>
-              <w:t xml:space="preserve">：点击车门各段发光芯片，观察车厢门扇联动，并自主破译工单“183</w:t>
-            </w:r>
-            <w:r>
-              <w:rPr>
-                <w:rFonts w:ascii="宋体" w:hAnsi="宋体" w:eastAsia="宋体"/>
-                <w:sz w:val="20"/>
-              </w:rPr>
-              <w:t xml:space="preserve"> </w:t>
-            </w:r>
-            <w:r>
-              <w:rPr>
-                <w:rFonts w:hint="eastAsia" w:ascii="宋体" w:hAnsi="宋体" w:eastAsia="宋体"/>
-                <w:sz w:val="20"/>
-              </w:rPr>
-              <w:t xml:space="preserve">1A”；</w:t>
-            </w:r>
-            <w:r>
-              <w:rPr>
-                <w:rFonts w:ascii="宋体" w:hAnsi="宋体" w:eastAsia="宋体"/>
-                <w:sz w:val="20"/>
-              </w:rPr>
-              <w:br/>
-            </w:r>
-            <w:r>
-              <w:rPr>
-                <w:rFonts w:ascii="宋体" w:hAnsi="宋体" w:eastAsia="宋体"/>
-                <w:sz w:val="20"/>
-              </w:rPr>
-              <w:t xml:space="preserve"> </w:t>
-            </w:r>
-            <w:r>
-              <w:rPr>
-                <w:rFonts w:ascii="宋体" w:hAnsi="宋体" w:eastAsia="宋体"/>
-                <w:sz w:val="20"/>
-              </w:rPr>
-              <w:t xml:space="preserve">·</w:t>
-            </w:r>
-            <w:r>
-              <w:rPr>
-                <w:rFonts w:ascii="宋体" w:hAnsi="宋体" w:eastAsia="宋体"/>
-                <w:sz w:val="20"/>
-              </w:rPr>
-              <w:t xml:space="preserve"> </w:t>
-            </w:r>
-            <w:r>
-              <w:rPr>
-                <w:rFonts w:hint="eastAsia" w:ascii="宋体" w:hAnsi="宋体" w:eastAsia="宋体"/>
-                <w:b/>
-                <w:bCs/>
-                <w:sz w:val="20"/>
-              </w:rPr>
-              <w:t xml:space="preserve">第四屏【通关测评】</w:t>
-            </w:r>
-            <w:r>
-              <w:rPr>
-                <w:rFonts w:hint="eastAsia" w:ascii="宋体" w:hAnsi="宋体" w:eastAsia="宋体"/>
-                <w:sz w:val="20"/>
-              </w:rPr>
-              <w:t xml:space="preserve">：限时完成2道微测验，提交查看统一成绩，点亮徽章；填写姓名班级，点击导出学习凭单txt文件。</w:t>
-            </w:r>
-            <w:r>
-              <w:rPr>
-                <w:rFonts w:ascii="宋体" w:hAnsi="宋体" w:eastAsia="宋体"/>
-                <w:sz w:val="20"/>
-              </w:rPr>
-              <w:br/>
-            </w:r>
-            <w:r>
-              <w:rPr>
-                <w:rFonts w:ascii="宋体" w:hAnsi="宋体" w:eastAsia="宋体"/>
-                <w:sz w:val="20"/>
-              </w:rPr>
-              <w:t xml:space="preserve">- </w:t>
-            </w:r>
-            <w:r>
-              <w:rPr>
-                <w:rFonts w:hint="eastAsia" w:ascii="宋体" w:hAnsi="宋体" w:eastAsia="宋体"/>
-                <w:sz w:val="20"/>
-              </w:rPr>
-              <w:t xml:space="preserve">巡视点拨操作卡点，鼓励同桌互助，保障全员达标。</w:t>
+              <w:t xml:space="preserve">指导完成导学单第二、三关</w:t>
+            </w:r>
+            <w:r>
+              <w:rPr>
+                <w:rFonts w:ascii="宋体" w:hAnsi="宋体" w:eastAsia="宋体"/>
+                <w:sz w:val="20"/>
+              </w:rPr>
+              <w:t xml:space="preserve">。</w:t>
             </w:r>
           </w:p>
         </w:tc>
@@ -2753,7 +1746,7 @@
                 <w:rFonts w:hint="eastAsia" w:ascii="宋体" w:hAnsi="宋体" w:eastAsia="宋体"/>
                 <w:sz w:val="20"/>
               </w:rPr>
-              <w:t xml:space="preserve">翻开导学单，认真完成第二关连线与第三关车门破译，同桌互查。</w:t>
+              <w:t xml:space="preserve">观察门牌、牛耳牌，体会编码带来的社会秩序。</w:t>
             </w:r>
             <w:r>
               <w:rPr>
@@ -2774,7 +1767,7 @@
                 <w:rFonts w:hint="eastAsia" w:ascii="宋体" w:hAnsi="宋体" w:eastAsia="宋体"/>
                 <w:sz w:val="20"/>
               </w:rPr>
-              <w:t xml:space="preserve">启动互动HTML作业，进行沉浸式人机互动。</w:t>
+              <w:t xml:space="preserve">认识数字、图形、经纬度与混合编码。</w:t>
             </w:r>
             <w:r>
               <w:rPr>
@@ -2795,28 +1788,21 @@
                 <w:rFonts w:hint="eastAsia" w:ascii="宋体" w:hAnsi="宋体" w:eastAsia="宋体"/>
                 <w:sz w:val="20"/>
               </w:rPr>
-              <w:t xml:space="preserve">完成积木拼装、卡片速配与车门故障微模拟，巩固编码原理。</w:t>
-            </w:r>
-            <w:r>
-              <w:rPr>
-                <w:rFonts w:ascii="宋体" w:hAnsi="宋体" w:eastAsia="宋体"/>
-                <w:sz w:val="20"/>
-              </w:rPr>
-              <w:br/>
-            </w:r>
-            <w:r>
-              <w:rPr>
-                <w:rFonts w:ascii="宋体" w:hAnsi="宋体" w:eastAsia="宋体"/>
-                <w:sz w:val="20"/>
-              </w:rPr>
-              <w:t xml:space="preserve">4. </w:t>
-            </w:r>
-            <w:r>
-              <w:rPr>
-                <w:rFonts w:hint="eastAsia" w:ascii="宋体" w:hAnsi="宋体" w:eastAsia="宋体"/>
-                <w:sz w:val="20"/>
-              </w:rPr>
-              <w:t xml:space="preserve">作答2道测验题，提交查看解析，勾选自评，输入姓名班级导出凭单txt文件，收获成就感。</w:t>
+              <w:t xml:space="preserve">破译521</w:t>
+            </w:r>
+            <w:r>
+              <w:rPr>
+                <w:rFonts w:ascii="宋体" w:hAnsi="宋体" w:eastAsia="宋体"/>
+                <w:sz w:val="20"/>
+              </w:rPr>
+              <w:t xml:space="preserve"> </w:t>
+            </w:r>
+            <w:r>
+              <w:rPr>
+                <w:rFonts w:hint="eastAsia" w:ascii="宋体" w:hAnsi="宋体" w:eastAsia="宋体"/>
+                <w:sz w:val="20"/>
+              </w:rPr>
+              <w:t xml:space="preserve">2B车门信息，完成导学单第二、三关连线与填空。</w:t>
             </w:r>
           </w:p>
         </w:tc>
@@ -2836,7 +1822,7 @@
                 <w:rFonts w:hint="eastAsia" w:ascii="宋体" w:hAnsi="宋体" w:eastAsia="宋体"/>
                 <w:sz w:val="20"/>
               </w:rPr>
-              <w:t xml:space="preserve">纸笔导学单与机房数字单文件交互深度融合。纸笔记录夯实概念，微模拟器增强体验趣味；通过即时判分、徽章与凭单导出，实现评价闭环与过程留痕。</w:t>
+              <w:t xml:space="preserve">拓宽视野，从单一数字拓展到多元形态，讲练即时融合。</w:t>
             </w:r>
           </w:p>
         </w:tc>
@@ -2861,7 +1847,39 @@
                 <w:bCs/>
                 <w:sz w:val="20"/>
               </w:rPr>
-              <w:t xml:space="preserve">全课小结</w:t>
+              <w:t xml:space="preserve">四、上机实操</w:t>
+            </w:r>
+            <w:r>
+              <w:rPr>
+                <w:rFonts w:ascii="宋体" w:hAnsi="宋体" w:eastAsia="宋体"/>
+                <w:sz w:val="20"/>
+              </w:rPr>
+              <w:br/>
+            </w:r>
+            <w:r>
+              <w:rPr>
+                <w:rFonts w:hint="eastAsia" w:ascii="宋体" w:hAnsi="宋体" w:eastAsia="宋体"/>
+                <w:b/>
+                <w:bCs/>
+                <w:sz w:val="20"/>
+              </w:rPr>
+              <w:t xml:space="preserve">互动破译实训</w:t>
+            </w:r>
+            <w:r>
+              <w:rPr>
+                <w:rFonts w:ascii="宋体" w:hAnsi="宋体" w:eastAsia="宋体"/>
+                <w:sz w:val="20"/>
+              </w:rPr>
+              <w:br/>
+            </w:r>
+            <w:r>
+              <w:rPr>
+                <w:rFonts w:hint="eastAsia" w:ascii="宋体" w:hAnsi="宋体" w:eastAsia="宋体"/>
+                <w:b/>
+                <w:bCs/>
+                <w:sz w:val="20"/>
+              </w:rPr>
+              <w:t xml:space="preserve">(14分钟)</w:t>
             </w:r>
           </w:p>
         </w:tc>
@@ -2897,14 +1915,14 @@
                 <w:bCs/>
                 <w:sz w:val="20"/>
               </w:rPr>
-              <w:t xml:space="preserve">知识梳理与思维升华</w:t>
-            </w:r>
-            <w:r>
-              <w:rPr>
-                <w:rFonts w:hint="eastAsia" w:ascii="宋体" w:hAnsi="宋体" w:eastAsia="宋体"/>
-                <w:sz w:val="20"/>
-              </w:rPr>
-              <w:t xml:space="preserve">：</w:t>
+              <w:t xml:space="preserve">组织上机互动作业</w:t>
+            </w:r>
+            <w:r>
+              <w:rPr>
+                <w:rFonts w:hint="eastAsia" w:ascii="宋体" w:hAnsi="宋体" w:eastAsia="宋体"/>
+                <w:sz w:val="20"/>
+              </w:rPr>
+              <w:t xml:space="preserve">：指导学生双击打开桌面《第10课-课堂作业.html》；</w:t>
             </w:r>
             <w:r>
               <w:rPr>
@@ -2918,84 +1936,7 @@
                 <w:rFonts w:ascii="宋体" w:hAnsi="宋体" w:eastAsia="宋体"/>
                 <w:sz w:val="20"/>
               </w:rPr>
-              <w:t xml:space="preserve">- </w:t>
-            </w:r>
-            <w:r>
-              <w:rPr>
-                <w:rFonts w:hint="eastAsia" w:ascii="宋体" w:hAnsi="宋体" w:eastAsia="宋体"/>
-                <w:sz w:val="20"/>
-              </w:rPr>
-              <w:t xml:space="preserve">师生共同回顾脉络：散乱数据</w:t>
-            </w:r>
-            <w:r>
-              <w:rPr>
-                <w:rFonts w:ascii="宋体" w:hAnsi="宋体" w:eastAsia="宋体"/>
-                <w:sz w:val="20"/>
-              </w:rPr>
-              <w:t xml:space="preserve"> ➔ </w:t>
-            </w:r>
-            <w:r>
-              <w:rPr>
-                <w:rFonts w:hint="eastAsia" w:ascii="宋体" w:hAnsi="宋体" w:eastAsia="宋体"/>
-                <w:sz w:val="20"/>
-              </w:rPr>
-              <w:t xml:space="preserve">约定规则</w:t>
-            </w:r>
-            <w:r>
-              <w:rPr>
-                <w:rFonts w:ascii="宋体" w:hAnsi="宋体" w:eastAsia="宋体"/>
-                <w:sz w:val="20"/>
-              </w:rPr>
-              <w:t xml:space="preserve"> ➔ </w:t>
-            </w:r>
-            <w:r>
-              <w:rPr>
-                <w:rFonts w:hint="eastAsia" w:ascii="宋体" w:hAnsi="宋体" w:eastAsia="宋体"/>
-                <w:sz w:val="20"/>
-              </w:rPr>
-              <w:t xml:space="preserve">规范编码</w:t>
-            </w:r>
-            <w:r>
-              <w:rPr>
-                <w:rFonts w:ascii="宋体" w:hAnsi="宋体" w:eastAsia="宋体"/>
-                <w:sz w:val="20"/>
-              </w:rPr>
-              <w:t xml:space="preserve"> ➔ </w:t>
-            </w:r>
-            <w:r>
-              <w:rPr>
-                <w:rFonts w:hint="eastAsia" w:ascii="宋体" w:hAnsi="宋体" w:eastAsia="宋体"/>
-                <w:sz w:val="20"/>
-              </w:rPr>
-              <w:t xml:space="preserve">唯一标识</w:t>
-            </w:r>
-            <w:r>
-              <w:rPr>
-                <w:rFonts w:ascii="宋体" w:hAnsi="宋体" w:eastAsia="宋体"/>
-                <w:sz w:val="20"/>
-              </w:rPr>
-              <w:t xml:space="preserve"> ➔ </w:t>
-            </w:r>
-            <w:r>
-              <w:rPr>
-                <w:rFonts w:hint="eastAsia" w:ascii="宋体" w:hAnsi="宋体" w:eastAsia="宋体"/>
-                <w:sz w:val="20"/>
-              </w:rPr>
-              <w:t xml:space="preserve">保持社会秩序。</w:t>
-            </w:r>
-            <w:r>
-              <w:rPr>
-                <w:rFonts w:ascii="宋体" w:hAnsi="宋体" w:eastAsia="宋体"/>
-                <w:sz w:val="20"/>
-              </w:rPr>
-              <w:br/>
-            </w:r>
-            <w:r>
-              <w:rPr>
-                <w:rFonts w:ascii="宋体" w:hAnsi="宋体" w:eastAsia="宋体"/>
-                <w:sz w:val="20"/>
-              </w:rPr>
-              <w:t xml:space="preserve">-</w:t>
+              <w:t xml:space="preserve">2.</w:t>
             </w:r>
             <w:r>
               <w:rPr>
@@ -3011,7 +1952,7 @@
                 <w:bCs/>
                 <w:sz w:val="20"/>
               </w:rPr>
-              <w:t xml:space="preserve">信息安全责任警示</w:t>
+              <w:t xml:space="preserve">巡视指导锦囊</w:t>
             </w:r>
             <w:r>
               <w:rPr>
@@ -3032,21 +1973,70 @@
                 <w:rFonts w:ascii="宋体" w:hAnsi="宋体" w:eastAsia="宋体"/>
                 <w:sz w:val="20"/>
               </w:rPr>
+              <w:t xml:space="preserve">- </w:t>
+            </w:r>
+            <w:r>
+              <w:rPr>
+                <w:rFonts w:hint="eastAsia" w:ascii="宋体" w:hAnsi="宋体" w:eastAsia="宋体"/>
+                <w:sz w:val="20"/>
+              </w:rPr>
+              <w:t xml:space="preserve">第一关：拼装学号积木，验证规则逻辑；</w:t>
+            </w:r>
+            <w:r>
+              <w:rPr>
+                <w:rFonts w:ascii="宋体" w:hAnsi="宋体" w:eastAsia="宋体"/>
+                <w:sz w:val="20"/>
+              </w:rPr>
+              <w:br/>
+            </w:r>
+            <w:r>
+              <w:rPr>
+                <w:rFonts w:ascii="宋体" w:hAnsi="宋体" w:eastAsia="宋体"/>
+                <w:sz w:val="20"/>
+              </w:rPr>
+              <w:t xml:space="preserve">- </w:t>
+            </w:r>
+            <w:r>
+              <w:rPr>
+                <w:rFonts w:hint="eastAsia" w:ascii="宋体" w:hAnsi="宋体" w:eastAsia="宋体"/>
+                <w:sz w:val="20"/>
+              </w:rPr>
+              <w:t xml:space="preserve">第二关：编码家族趣味连连看；</w:t>
+            </w:r>
+            <w:r>
+              <w:rPr>
+                <w:rFonts w:ascii="宋体" w:hAnsi="宋体" w:eastAsia="宋体"/>
+                <w:sz w:val="20"/>
+              </w:rPr>
+              <w:br/>
+            </w:r>
+            <w:r>
+              <w:rPr>
+                <w:rFonts w:ascii="宋体" w:hAnsi="宋体" w:eastAsia="宋体"/>
+                <w:sz w:val="20"/>
+              </w:rPr>
+              <w:t xml:space="preserve">- </w:t>
+            </w:r>
+            <w:r>
+              <w:rPr>
+                <w:rFonts w:hint="eastAsia" w:ascii="宋体" w:hAnsi="宋体" w:eastAsia="宋体"/>
+                <w:sz w:val="20"/>
+              </w:rPr>
+              <w:t xml:space="preserve">第三关：点击车门发光部件，破译新工单“183</w:t>
+            </w:r>
+            <w:r>
+              <w:rPr>
+                <w:rFonts w:ascii="宋体" w:hAnsi="宋体" w:eastAsia="宋体"/>
+                <w:sz w:val="20"/>
+              </w:rPr>
               <w:t xml:space="preserve"> </w:t>
             </w:r>
             <w:r>
               <w:rPr>
-                <w:rFonts w:ascii="宋体" w:hAnsi="宋体" w:eastAsia="宋体"/>
-                <w:sz w:val="20"/>
-              </w:rPr>
-              <w:t xml:space="preserve">· </w:t>
-            </w:r>
-            <w:r>
-              <w:rPr>
-                <w:rFonts w:hint="eastAsia" w:ascii="宋体" w:hAnsi="宋体" w:eastAsia="宋体"/>
-                <w:sz w:val="20"/>
-              </w:rPr>
-              <w:t xml:space="preserve">提问：“既然编码具有唯一性，身份证号、社保卡号、学籍号能不能发到陌生网站上？”</w:t>
+                <w:rFonts w:hint="eastAsia" w:ascii="宋体" w:hAnsi="宋体" w:eastAsia="宋体"/>
+                <w:sz w:val="20"/>
+              </w:rPr>
+              <w:t xml:space="preserve">1A”；</w:t>
             </w:r>
             <w:r>
               <w:rPr>
@@ -3060,21 +2050,14 @@
                 <w:rFonts w:ascii="宋体" w:hAnsi="宋体" w:eastAsia="宋体"/>
                 <w:sz w:val="20"/>
               </w:rPr>
-              <w:t xml:space="preserve"> </w:t>
-            </w:r>
-            <w:r>
-              <w:rPr>
-                <w:rFonts w:ascii="宋体" w:hAnsi="宋体" w:eastAsia="宋体"/>
-                <w:sz w:val="20"/>
-              </w:rPr>
-              <w:t xml:space="preserve">· </w:t>
-            </w:r>
-            <w:r>
-              <w:rPr>
-                <w:rFonts w:hint="eastAsia" w:ascii="宋体" w:hAnsi="宋体" w:eastAsia="宋体"/>
-                <w:sz w:val="20"/>
-              </w:rPr>
-              <w:t xml:space="preserve">总结：“关键个人编码就像家门钥匙，必须妥善保管，谨防泄露与诈骗！”</w:t>
+              <w:t xml:space="preserve">- </w:t>
+            </w:r>
+            <w:r>
+              <w:rPr>
+                <w:rFonts w:hint="eastAsia" w:ascii="宋体" w:hAnsi="宋体" w:eastAsia="宋体"/>
+                <w:sz w:val="20"/>
+              </w:rPr>
+              <w:t xml:space="preserve">第四关：2道随堂微测验判分，勾选自评，导出学习凭单txt文件。</w:t>
             </w:r>
             <w:r>
               <w:rPr>
@@ -3088,109 +2071,14 @@
                 <w:rFonts w:ascii="宋体" w:hAnsi="宋体" w:eastAsia="宋体"/>
                 <w:sz w:val="20"/>
               </w:rPr>
-              <w:t xml:space="preserve">2.</w:t>
-            </w:r>
-            <w:r>
-              <w:rPr>
-                <w:rFonts w:ascii="宋体" w:hAnsi="宋体" w:eastAsia="宋体"/>
-                <w:sz w:val="20"/>
-              </w:rPr>
-              <w:t xml:space="preserve"> </w:t>
-            </w:r>
-            <w:r>
-              <w:rPr>
-                <w:rFonts w:hint="eastAsia" w:ascii="宋体" w:hAnsi="宋体" w:eastAsia="宋体"/>
-                <w:b/>
-                <w:bCs/>
-                <w:sz w:val="20"/>
-              </w:rPr>
-              <w:t xml:space="preserve">文明上机好习惯打卡</w:t>
-            </w:r>
-            <w:r>
-              <w:rPr>
-                <w:rFonts w:hint="eastAsia" w:ascii="宋体" w:hAnsi="宋体" w:eastAsia="宋体"/>
-                <w:sz w:val="20"/>
-              </w:rPr>
-              <w:t xml:space="preserve">：</w:t>
-            </w:r>
-            <w:r>
-              <w:rPr>
-                <w:rFonts w:ascii="宋体" w:hAnsi="宋体" w:eastAsia="宋体"/>
-                <w:sz w:val="20"/>
-              </w:rPr>
-              <w:br/>
-            </w:r>
-            <w:r>
-              <w:rPr>
-                <w:rFonts w:ascii="宋体" w:hAnsi="宋体" w:eastAsia="宋体"/>
-                <w:sz w:val="20"/>
-              </w:rPr>
-              <w:t xml:space="preserve">- </w:t>
-            </w:r>
-            <w:r>
-              <w:rPr>
-                <w:rFonts w:hint="eastAsia" w:ascii="宋体" w:hAnsi="宋体" w:eastAsia="宋体"/>
-                <w:sz w:val="20"/>
-              </w:rPr>
-              <w:t xml:space="preserve">督促学生完成导学单好习惯自评：关闭网页软件，规范点击【开始】➔【关机】；键盘推入槽内，鼠标摆正，桌椅归位。</w:t>
-            </w:r>
-            <w:r>
-              <w:rPr>
-                <w:rFonts w:ascii="宋体" w:hAnsi="宋体" w:eastAsia="宋体"/>
-                <w:sz w:val="20"/>
-              </w:rPr>
-              <w:br/>
-            </w:r>
-            <w:r>
-              <w:rPr>
-                <w:rFonts w:ascii="宋体" w:hAnsi="宋体" w:eastAsia="宋体"/>
-                <w:sz w:val="20"/>
-              </w:rPr>
-              <w:t xml:space="preserve">3.</w:t>
-            </w:r>
-            <w:r>
-              <w:rPr>
-                <w:rFonts w:ascii="宋体" w:hAnsi="宋体" w:eastAsia="宋体"/>
-                <w:sz w:val="20"/>
-              </w:rPr>
-              <w:t xml:space="preserve"> </w:t>
-            </w:r>
-            <w:r>
-              <w:rPr>
-                <w:rFonts w:hint="eastAsia" w:ascii="宋体" w:hAnsi="宋体" w:eastAsia="宋体"/>
-                <w:b/>
-                <w:bCs/>
-                <w:sz w:val="20"/>
-              </w:rPr>
-              <w:t xml:space="preserve">布置课后生活实践（课本P43“练习”）</w:t>
-            </w:r>
-            <w:r>
-              <w:rPr>
-                <w:rFonts w:hint="eastAsia" w:ascii="宋体" w:hAnsi="宋体" w:eastAsia="宋体"/>
-                <w:sz w:val="20"/>
-              </w:rPr>
-              <w:t xml:space="preserve">：</w:t>
-            </w:r>
-            <w:r>
-              <w:rPr>
-                <w:rFonts w:ascii="宋体" w:hAnsi="宋体" w:eastAsia="宋体"/>
-                <w:sz w:val="20"/>
-              </w:rPr>
-              <w:br/>
-            </w:r>
-            <w:r>
-              <w:rPr>
-                <w:rFonts w:ascii="宋体" w:hAnsi="宋体" w:eastAsia="宋体"/>
-                <w:sz w:val="20"/>
-              </w:rPr>
-              <w:t xml:space="preserve">- </w:t>
-            </w:r>
-            <w:r>
-              <w:rPr>
-                <w:rFonts w:hint="eastAsia" w:ascii="宋体" w:hAnsi="宋体" w:eastAsia="宋体"/>
-                <w:sz w:val="20"/>
-              </w:rPr>
-              <w:t xml:space="preserve">“回家后在家长陪同下观察超市同一品牌不同商品的条形码，记录厂商代码和商品代码，下节课一起分享！”</w:t>
+              <w:t xml:space="preserve">3. </w:t>
+            </w:r>
+            <w:r>
+              <w:rPr>
+                <w:rFonts w:hint="eastAsia" w:ascii="宋体" w:hAnsi="宋体" w:eastAsia="宋体"/>
+                <w:sz w:val="20"/>
+              </w:rPr>
+              <w:t xml:space="preserve">重点巡视车门“A左B右”的区分卡点。</w:t>
             </w:r>
           </w:p>
         </w:tc>
@@ -3217,7 +2105,7 @@
                 <w:rFonts w:hint="eastAsia" w:ascii="宋体" w:hAnsi="宋体" w:eastAsia="宋体"/>
                 <w:sz w:val="20"/>
               </w:rPr>
-              <w:t xml:space="preserve">复述本节课核心知识，体会编码对现代社会的价值。</w:t>
+              <w:t xml:space="preserve">启动单文件HTML作业，沉浸式自主闯关。</w:t>
             </w:r>
             <w:r>
               <w:rPr>
@@ -3238,7 +2126,7 @@
                 <w:rFonts w:hint="eastAsia" w:ascii="宋体" w:hAnsi="宋体" w:eastAsia="宋体"/>
                 <w:sz w:val="20"/>
               </w:rPr>
-              <w:t xml:space="preserve">牢记个人编码的安全防护提醒，树立自律意识。</w:t>
+              <w:t xml:space="preserve">动手拼装积木、车门解剖微模拟。</w:t>
             </w:r>
             <w:r>
               <w:rPr>
@@ -3259,28 +2147,7 @@
                 <w:rFonts w:hint="eastAsia" w:ascii="宋体" w:hAnsi="宋体" w:eastAsia="宋体"/>
                 <w:sz w:val="20"/>
               </w:rPr>
-              <w:t xml:space="preserve">勾选导学单好习惯打卡，规范关机并整理工位。</w:t>
-            </w:r>
-            <w:r>
-              <w:rPr>
-                <w:rFonts w:ascii="宋体" w:hAnsi="宋体" w:eastAsia="宋体"/>
-                <w:sz w:val="20"/>
-              </w:rPr>
-              <w:br/>
-            </w:r>
-            <w:r>
-              <w:rPr>
-                <w:rFonts w:ascii="宋体" w:hAnsi="宋体" w:eastAsia="宋体"/>
-                <w:sz w:val="20"/>
-              </w:rPr>
-              <w:t xml:space="preserve">4. </w:t>
-            </w:r>
-            <w:r>
-              <w:rPr>
-                <w:rFonts w:hint="eastAsia" w:ascii="宋体" w:hAnsi="宋体" w:eastAsia="宋体"/>
-                <w:sz w:val="20"/>
-              </w:rPr>
-              <w:t xml:space="preserve">明确课后超市商品条码调查任务，期待生活新探索。</w:t>
+              <w:t xml:space="preserve">提交测验查看即时成绩，点亮徽章，一键导出txt学习凭单。</w:t>
             </w:r>
           </w:p>
         </w:tc>
@@ -3300,13 +2167,954 @@
                 <w:rFonts w:hint="eastAsia" w:ascii="宋体" w:hAnsi="宋体" w:eastAsia="宋体"/>
                 <w:sz w:val="20"/>
               </w:rPr>
-              <w:t xml:space="preserve">构建教学闭环。从小结提炼计算思维与信息意识，融入安全责任教育；强化机房行为规范；依托课本P43练习实现课后延伸。</w:t>
+              <w:t xml:space="preserve">纸笔导学单与机房数字仿真交互深度互补，即时判分反馈。</w:t>
+            </w:r>
+          </w:p>
+        </w:tc>
+      </w:tr>
+      <w:tr>
+        <w:tc>
+          <w:tcPr>
+            <w:vAlign w:val="center"/>
+            <w:shd w:fill="FAFAFC"/>
+          </w:tcPr>
+          <w:p>
+            <w:pPr>
+              <w:pStyle w:val="Compact"/>
+              <w:spacing w:before="20" w:after="20" w:line="300" w:lineRule="auto"/>
+              <w:ind w:firstLine="0"/>
+              <w:jc w:val="left"/>
+            </w:pPr>
+            <w:r>
+              <w:rPr>
+                <w:rFonts w:hint="eastAsia" w:ascii="宋体" w:hAnsi="宋体" w:eastAsia="宋体"/>
+                <w:b/>
+                <w:bCs/>
+                <w:sz w:val="20"/>
+              </w:rPr>
+              <w:t xml:space="preserve">五、全课小结</w:t>
+            </w:r>
+            <w:r>
+              <w:rPr>
+                <w:rFonts w:ascii="宋体" w:hAnsi="宋体" w:eastAsia="宋体"/>
+                <w:sz w:val="20"/>
+              </w:rPr>
+              <w:br/>
+            </w:r>
+            <w:r>
+              <w:rPr>
+                <w:rFonts w:hint="eastAsia" w:ascii="宋体" w:hAnsi="宋体" w:eastAsia="宋体"/>
+                <w:b/>
+                <w:bCs/>
+                <w:sz w:val="20"/>
+              </w:rPr>
+              <w:t xml:space="preserve">安全自律打卡</w:t>
+            </w:r>
+            <w:r>
+              <w:rPr>
+                <w:rFonts w:ascii="宋体" w:hAnsi="宋体" w:eastAsia="宋体"/>
+                <w:sz w:val="20"/>
+              </w:rPr>
+              <w:br/>
+            </w:r>
+            <w:r>
+              <w:rPr>
+                <w:rFonts w:hint="eastAsia" w:ascii="宋体" w:hAnsi="宋体" w:eastAsia="宋体"/>
+                <w:b/>
+                <w:bCs/>
+                <w:sz w:val="20"/>
+              </w:rPr>
+              <w:t xml:space="preserve">(5分钟)</w:t>
+            </w:r>
+          </w:p>
+        </w:tc>
+        <w:tc>
+          <w:tcPr>
+            <w:vAlign w:val="center"/>
+          </w:tcPr>
+          <w:p>
+            <w:pPr>
+              <w:pStyle w:val="Compact"/>
+              <w:spacing w:before="20" w:after="20" w:line="300" w:lineRule="auto"/>
+              <w:ind w:firstLine="0"/>
+              <w:jc w:val="left"/>
+            </w:pPr>
+            <w:r>
+              <w:rPr>
+                <w:rFonts w:ascii="宋体" w:hAnsi="宋体" w:eastAsia="宋体"/>
+                <w:sz w:val="20"/>
+              </w:rPr>
+              <w:t xml:space="preserve">1.</w:t>
+            </w:r>
+            <w:r>
+              <w:rPr>
+                <w:rFonts w:ascii="宋体" w:hAnsi="宋体" w:eastAsia="宋体"/>
+                <w:sz w:val="20"/>
+              </w:rPr>
+              <w:t xml:space="preserve"> </w:t>
+            </w:r>
+            <w:r>
+              <w:rPr>
+                <w:rFonts w:hint="eastAsia" w:ascii="宋体" w:hAnsi="宋体" w:eastAsia="宋体"/>
+                <w:b/>
+                <w:bCs/>
+                <w:sz w:val="20"/>
+              </w:rPr>
+              <w:t xml:space="preserve">知识梳理与升华</w:t>
+            </w:r>
+            <w:r>
+              <w:rPr>
+                <w:rFonts w:hint="eastAsia" w:ascii="宋体" w:hAnsi="宋体" w:eastAsia="宋体"/>
+                <w:sz w:val="20"/>
+              </w:rPr>
+              <w:t xml:space="preserve">：散乱数据</w:t>
+            </w:r>
+            <w:r>
+              <w:rPr>
+                <w:rFonts w:ascii="宋体" w:hAnsi="宋体" w:eastAsia="宋体"/>
+                <w:sz w:val="20"/>
+              </w:rPr>
+              <w:t xml:space="preserve"> ➔ </w:t>
+            </w:r>
+            <w:r>
+              <w:rPr>
+                <w:rFonts w:hint="eastAsia" w:ascii="宋体" w:hAnsi="宋体" w:eastAsia="宋体"/>
+                <w:sz w:val="20"/>
+              </w:rPr>
+              <w:t xml:space="preserve">约定规则</w:t>
+            </w:r>
+            <w:r>
+              <w:rPr>
+                <w:rFonts w:ascii="宋体" w:hAnsi="宋体" w:eastAsia="宋体"/>
+                <w:sz w:val="20"/>
+              </w:rPr>
+              <w:t xml:space="preserve"> ➔ </w:t>
+            </w:r>
+            <w:r>
+              <w:rPr>
+                <w:rFonts w:hint="eastAsia" w:ascii="宋体" w:hAnsi="宋体" w:eastAsia="宋体"/>
+                <w:sz w:val="20"/>
+              </w:rPr>
+              <w:t xml:space="preserve">规范编码</w:t>
+            </w:r>
+            <w:r>
+              <w:rPr>
+                <w:rFonts w:ascii="宋体" w:hAnsi="宋体" w:eastAsia="宋体"/>
+                <w:sz w:val="20"/>
+              </w:rPr>
+              <w:t xml:space="preserve"> ➔ </w:t>
+            </w:r>
+            <w:r>
+              <w:rPr>
+                <w:rFonts w:hint="eastAsia" w:ascii="宋体" w:hAnsi="宋体" w:eastAsia="宋体"/>
+                <w:sz w:val="20"/>
+              </w:rPr>
+              <w:t xml:space="preserve">唯一标识</w:t>
+            </w:r>
+            <w:r>
+              <w:rPr>
+                <w:rFonts w:ascii="宋体" w:hAnsi="宋体" w:eastAsia="宋体"/>
+                <w:sz w:val="20"/>
+              </w:rPr>
+              <w:t xml:space="preserve"> ➔ </w:t>
+            </w:r>
+            <w:r>
+              <w:rPr>
+                <w:rFonts w:hint="eastAsia" w:ascii="宋体" w:hAnsi="宋体" w:eastAsia="宋体"/>
+                <w:sz w:val="20"/>
+              </w:rPr>
+              <w:t xml:space="preserve">保持社会秩序。</w:t>
+            </w:r>
+            <w:r>
+              <w:rPr>
+                <w:rFonts w:ascii="宋体" w:hAnsi="宋体" w:eastAsia="宋体"/>
+                <w:sz w:val="20"/>
+              </w:rPr>
+              <w:br/>
+            </w:r>
+            <w:r>
+              <w:rPr>
+                <w:rFonts w:ascii="宋体" w:hAnsi="宋体" w:eastAsia="宋体"/>
+                <w:sz w:val="20"/>
+              </w:rPr>
+              <w:t xml:space="preserve">2.</w:t>
+            </w:r>
+            <w:r>
+              <w:rPr>
+                <w:rFonts w:ascii="宋体" w:hAnsi="宋体" w:eastAsia="宋体"/>
+                <w:sz w:val="20"/>
+              </w:rPr>
+              <w:t xml:space="preserve"> </w:t>
+            </w:r>
+            <w:r>
+              <w:rPr>
+                <w:rFonts w:hint="eastAsia" w:ascii="宋体" w:hAnsi="宋体" w:eastAsia="宋体"/>
+                <w:b/>
+                <w:bCs/>
+                <w:sz w:val="20"/>
+              </w:rPr>
+              <w:t xml:space="preserve">安全责任点拨</w:t>
+            </w:r>
+            <w:r>
+              <w:rPr>
+                <w:rFonts w:hint="eastAsia" w:ascii="宋体" w:hAnsi="宋体" w:eastAsia="宋体"/>
+                <w:sz w:val="20"/>
+              </w:rPr>
+              <w:t xml:space="preserve">：“身份证号、学籍号等关键个人编码是个人数字钥匙，严禁随意在陌生网站泄露！”</w:t>
+            </w:r>
+            <w:r>
+              <w:rPr>
+                <w:rFonts w:ascii="宋体" w:hAnsi="宋体" w:eastAsia="宋体"/>
+                <w:sz w:val="20"/>
+              </w:rPr>
+              <w:br/>
+            </w:r>
+            <w:r>
+              <w:rPr>
+                <w:rFonts w:ascii="宋体" w:hAnsi="宋体" w:eastAsia="宋体"/>
+                <w:sz w:val="20"/>
+              </w:rPr>
+              <w:t xml:space="preserve">3.</w:t>
+            </w:r>
+            <w:r>
+              <w:rPr>
+                <w:rFonts w:ascii="宋体" w:hAnsi="宋体" w:eastAsia="宋体"/>
+                <w:sz w:val="20"/>
+              </w:rPr>
+              <w:t xml:space="preserve"> </w:t>
+            </w:r>
+            <w:r>
+              <w:rPr>
+                <w:rFonts w:hint="eastAsia" w:ascii="宋体" w:hAnsi="宋体" w:eastAsia="宋体"/>
+                <w:b/>
+                <w:bCs/>
+                <w:sz w:val="20"/>
+              </w:rPr>
+              <w:t xml:space="preserve">好习惯打卡与整理</w:t>
+            </w:r>
+            <w:r>
+              <w:rPr>
+                <w:rFonts w:hint="eastAsia" w:ascii="宋体" w:hAnsi="宋体" w:eastAsia="宋体"/>
+                <w:sz w:val="20"/>
+              </w:rPr>
+              <w:t xml:space="preserve">：指导工位整理（键鼠归位、椅子推入桌下）并完成星级自评。</w:t>
+            </w:r>
+          </w:p>
+        </w:tc>
+        <w:tc>
+          <w:tcPr>
+            <w:vAlign w:val="center"/>
+          </w:tcPr>
+          <w:p>
+            <w:pPr>
+              <w:pStyle w:val="Compact"/>
+              <w:spacing w:before="20" w:after="20" w:line="300" w:lineRule="auto"/>
+              <w:ind w:firstLine="0"/>
+              <w:jc w:val="left"/>
+            </w:pPr>
+            <w:r>
+              <w:rPr>
+                <w:rFonts w:ascii="宋体" w:hAnsi="宋体" w:eastAsia="宋体"/>
+                <w:sz w:val="20"/>
+              </w:rPr>
+              <w:t xml:space="preserve">1. </w:t>
+            </w:r>
+            <w:r>
+              <w:rPr>
+                <w:rFonts w:hint="eastAsia" w:ascii="宋体" w:hAnsi="宋体" w:eastAsia="宋体"/>
+                <w:sz w:val="20"/>
+              </w:rPr>
+              <w:t xml:space="preserve">梳理全课脉络，树立编码信息安全防范意识。</w:t>
+            </w:r>
+            <w:r>
+              <w:rPr>
+                <w:rFonts w:ascii="宋体" w:hAnsi="宋体" w:eastAsia="宋体"/>
+                <w:sz w:val="20"/>
+              </w:rPr>
+              <w:br/>
+            </w:r>
+            <w:r>
+              <w:rPr>
+                <w:rFonts w:ascii="宋体" w:hAnsi="宋体" w:eastAsia="宋体"/>
+                <w:sz w:val="20"/>
+              </w:rPr>
+              <w:t xml:space="preserve">2. </w:t>
+            </w:r>
+            <w:r>
+              <w:rPr>
+                <w:rFonts w:hint="eastAsia" w:ascii="宋体" w:hAnsi="宋体" w:eastAsia="宋体"/>
+                <w:sz w:val="20"/>
+              </w:rPr>
+              <w:t xml:space="preserve">规范关机，整理机房工位。</w:t>
+            </w:r>
+            <w:r>
+              <w:rPr>
+                <w:rFonts w:ascii="宋体" w:hAnsi="宋体" w:eastAsia="宋体"/>
+                <w:sz w:val="20"/>
+              </w:rPr>
+              <w:br/>
+            </w:r>
+            <w:r>
+              <w:rPr>
+                <w:rFonts w:ascii="宋体" w:hAnsi="宋体" w:eastAsia="宋体"/>
+                <w:sz w:val="20"/>
+              </w:rPr>
+              <w:t xml:space="preserve">3. </w:t>
+            </w:r>
+            <w:r>
+              <w:rPr>
+                <w:rFonts w:hint="eastAsia" w:ascii="宋体" w:hAnsi="宋体" w:eastAsia="宋体"/>
+                <w:sz w:val="20"/>
+              </w:rPr>
+              <w:t xml:space="preserve">完成导学单三星自评打卡。</w:t>
+            </w:r>
+          </w:p>
+        </w:tc>
+        <w:tc>
+          <w:tcPr>
+            <w:vAlign w:val="center"/>
+          </w:tcPr>
+          <w:p>
+            <w:pPr>
+              <w:pStyle w:val="Compact"/>
+              <w:spacing w:before="20" w:after="20" w:line="300" w:lineRule="auto"/>
+              <w:ind w:firstLine="0"/>
+              <w:jc w:val="left"/>
+            </w:pPr>
+            <w:r>
+              <w:rPr>
+                <w:rFonts w:hint="eastAsia" w:ascii="宋体" w:hAnsi="宋体" w:eastAsia="宋体"/>
+                <w:sz w:val="20"/>
+              </w:rPr>
+              <w:t xml:space="preserve">形成教学闭环，融入信息安全素养，抓实机房日常规范。</w:t>
             </w:r>
           </w:p>
         </w:tc>
       </w:tr>
     </w:tbl>
-    <w:bookmarkEnd w:id="9"/>
+    <w:bookmarkEnd w:id="14"/>
+    <w:bookmarkStart w:id="18" w:name="_七作业"/>
+    <w:p>
+      <w:pPr>
+        <w:pStyle w:val="2"/>
+        <w:spacing w:before="200" w:after="80" w:line="312" w:lineRule="auto"/>
+        <w:ind w:firstLine="0"/>
+        <w:jc w:val="left"/>
+      </w:pPr>
+      <w:r>
+        <w:rPr>
+          <w:rFonts w:hint="eastAsia" w:ascii="黑体" w:hAnsi="黑体" w:eastAsia="黑体"/>
+          <w:b/>
+          <w:color w:val="2E1F5E"/>
+          <w:sz w:val="26"/>
+        </w:rPr>
+        <w:t xml:space="preserve">七、作业</w:t>
+      </w:r>
+    </w:p>
+    <w:bookmarkStart w:id="15" w:name="_导学单"/>
+    <w:p>
+      <w:pPr>
+        <w:pStyle w:val="3"/>
+        <w:spacing w:before="120" w:after="60" w:line="312" w:lineRule="auto"/>
+        <w:ind w:firstLine="0"/>
+        <w:jc w:val="left"/>
+      </w:pPr>
+      <w:r>
+        <w:rPr>
+          <w:rFonts w:ascii="黑体" w:hAnsi="黑体" w:eastAsia="黑体"/>
+          <w:b/>
+          <w:color w:val="403070"/>
+          <w:sz w:val="23"/>
+        </w:rPr>
+        <w:t xml:space="preserve">1. </w:t>
+      </w:r>
+      <w:r>
+        <w:rPr>
+          <w:rFonts w:hint="eastAsia" w:ascii="黑体" w:hAnsi="黑体" w:eastAsia="黑体"/>
+          <w:b/>
+          <w:color w:val="403070"/>
+          <w:sz w:val="23"/>
+        </w:rPr>
+        <w:t xml:space="preserve">导学单</w:t>
+      </w:r>
+    </w:p>
+    <w:p>
+      <w:pPr>
+        <w:pStyle w:val="Compact"/>
+        <w:numPr>
+          <w:ilvl w:val="0"/>
+          <w:numId w:val="1002"/>
+        </w:numPr>
+        <w:spacing w:before="0" w:after="60" w:line="312" w:lineRule="auto"/>
+        <w:ind w:firstLine="0" w:left="280"/>
+      </w:pPr>
+      <w:r>
+        <w:rPr>
+          <w:rFonts w:ascii="宋体" w:hAnsi="宋体" w:eastAsia="宋体"/>
+          <w:b/>
+          <w:bCs/>
+          <w:sz w:val="21"/>
+        </w:rPr>
+        <w:t xml:space="preserve">⭐ </w:t>
+      </w:r>
+      <w:r>
+        <w:rPr>
+          <w:rFonts w:hint="eastAsia" w:ascii="宋体" w:hAnsi="宋体" w:eastAsia="宋体"/>
+          <w:b/>
+          <w:bCs/>
+          <w:sz w:val="21"/>
+        </w:rPr>
+        <w:t xml:space="preserve">基础星（全员必做</w:t>
+      </w:r>
+      <w:r>
+        <w:rPr>
+          <w:rFonts w:ascii="宋体" w:hAnsi="宋体" w:eastAsia="宋体"/>
+          <w:b/>
+          <w:bCs/>
+          <w:sz w:val="21"/>
+        </w:rPr>
+        <w:t xml:space="preserve"> · </w:t>
+      </w:r>
+      <w:r>
+        <w:rPr>
+          <w:rFonts w:hint="eastAsia" w:ascii="宋体" w:hAnsi="宋体" w:eastAsia="宋体"/>
+          <w:b/>
+          <w:bCs/>
+          <w:sz w:val="21"/>
+        </w:rPr>
+        <w:t xml:space="preserve">对应第一关）</w:t>
+      </w:r>
+      <w:r>
+        <w:rPr>
+          <w:rFonts w:hint="eastAsia" w:ascii="宋体" w:hAnsi="宋体" w:eastAsia="宋体"/>
+          <w:sz w:val="21"/>
+        </w:rPr>
+        <w:t xml:space="preserve">：完成学号密码规律梳理，正确补齐周雨欣学号；</w:t>
+      </w:r>
+    </w:p>
+    <w:p>
+      <w:pPr>
+        <w:pStyle w:val="Compact"/>
+        <w:numPr>
+          <w:ilvl w:val="0"/>
+          <w:numId w:val="1002"/>
+        </w:numPr>
+        <w:spacing w:before="0" w:after="60" w:line="312" w:lineRule="auto"/>
+        <w:ind w:firstLine="0" w:left="280"/>
+      </w:pPr>
+      <w:r>
+        <w:rPr>
+          <w:rFonts w:ascii="宋体" w:hAnsi="宋体" w:eastAsia="宋体"/>
+          <w:b/>
+          <w:bCs/>
+          <w:sz w:val="21"/>
+        </w:rPr>
+        <w:t xml:space="preserve">⭐⭐ </w:t>
+      </w:r>
+      <w:r>
+        <w:rPr>
+          <w:rFonts w:hint="eastAsia" w:ascii="宋体" w:hAnsi="宋体" w:eastAsia="宋体"/>
+          <w:b/>
+          <w:bCs/>
+          <w:sz w:val="21"/>
+        </w:rPr>
+        <w:t xml:space="preserve">进阶星（探究强化</w:t>
+      </w:r>
+      <w:r>
+        <w:rPr>
+          <w:rFonts w:ascii="宋体" w:hAnsi="宋体" w:eastAsia="宋体"/>
+          <w:b/>
+          <w:bCs/>
+          <w:sz w:val="21"/>
+        </w:rPr>
+        <w:t xml:space="preserve"> · </w:t>
+      </w:r>
+      <w:r>
+        <w:rPr>
+          <w:rFonts w:hint="eastAsia" w:ascii="宋体" w:hAnsi="宋体" w:eastAsia="宋体"/>
+          <w:b/>
+          <w:bCs/>
+          <w:sz w:val="21"/>
+        </w:rPr>
+        <w:t xml:space="preserve">对应第二关）</w:t>
+      </w:r>
+      <w:r>
+        <w:rPr>
+          <w:rFonts w:hint="eastAsia" w:ascii="宋体" w:hAnsi="宋体" w:eastAsia="宋体"/>
+          <w:sz w:val="21"/>
+        </w:rPr>
+        <w:t xml:space="preserve">：完成手机号、商品条码、地理坐标、地铁车门与呈现方式的连线配对；</w:t>
+      </w:r>
+    </w:p>
+    <w:p>
+      <w:pPr>
+        <w:pStyle w:val="Compact"/>
+        <w:numPr>
+          <w:ilvl w:val="0"/>
+          <w:numId w:val="1002"/>
+        </w:numPr>
+        <w:spacing w:before="0" w:after="60" w:line="312" w:lineRule="auto"/>
+        <w:ind w:firstLine="0" w:left="280"/>
+      </w:pPr>
+      <w:r>
+        <w:rPr>
+          <w:rFonts w:ascii="宋体" w:hAnsi="宋体" w:eastAsia="宋体"/>
+          <w:b/>
+          <w:bCs/>
+          <w:sz w:val="21"/>
+        </w:rPr>
+        <w:t xml:space="preserve">⭐⭐⭐ </w:t>
+      </w:r>
+      <w:r>
+        <w:rPr>
+          <w:rFonts w:hint="eastAsia" w:ascii="宋体" w:hAnsi="宋体" w:eastAsia="宋体"/>
+          <w:b/>
+          <w:bCs/>
+          <w:sz w:val="21"/>
+        </w:rPr>
+        <w:t xml:space="preserve">挑战星（实操破译</w:t>
+      </w:r>
+      <w:r>
+        <w:rPr>
+          <w:rFonts w:ascii="宋体" w:hAnsi="宋体" w:eastAsia="宋体"/>
+          <w:b/>
+          <w:bCs/>
+          <w:sz w:val="21"/>
+        </w:rPr>
+        <w:t xml:space="preserve"> · </w:t>
+      </w:r>
+      <w:r>
+        <w:rPr>
+          <w:rFonts w:hint="eastAsia" w:ascii="宋体" w:hAnsi="宋体" w:eastAsia="宋体"/>
+          <w:b/>
+          <w:bCs/>
+          <w:sz w:val="21"/>
+        </w:rPr>
+        <w:t xml:space="preserve">对应第三关）</w:t>
+      </w:r>
+      <w:r>
+        <w:rPr>
+          <w:rFonts w:hint="eastAsia" w:ascii="宋体" w:hAnsi="宋体" w:eastAsia="宋体"/>
+          <w:sz w:val="21"/>
+        </w:rPr>
+        <w:t xml:space="preserve">：破译地铁车门“521</w:t>
+      </w:r>
+      <w:r>
+        <w:rPr>
+          <w:rFonts w:ascii="宋体" w:hAnsi="宋体" w:eastAsia="宋体"/>
+          <w:sz w:val="21"/>
+        </w:rPr>
+        <w:t xml:space="preserve"> </w:t>
+      </w:r>
+      <w:r>
+        <w:rPr>
+          <w:rFonts w:hint="eastAsia" w:ascii="宋体" w:hAnsi="宋体" w:eastAsia="宋体"/>
+          <w:sz w:val="21"/>
+        </w:rPr>
+        <w:t xml:space="preserve">2B”的具体含义，完成上机HTML故障破译实训；</w:t>
+      </w:r>
+    </w:p>
+    <w:p>
+      <w:pPr>
+        <w:pStyle w:val="Compact"/>
+        <w:numPr>
+          <w:ilvl w:val="0"/>
+          <w:numId w:val="1002"/>
+        </w:numPr>
+        <w:spacing w:before="0" w:after="60" w:line="312" w:lineRule="auto"/>
+        <w:ind w:firstLine="0" w:left="280"/>
+      </w:pPr>
+      <w:r>
+        <w:rPr>
+          <w:rFonts w:ascii="宋体" w:hAnsi="宋体" w:eastAsia="宋体"/>
+          <w:b/>
+          <w:bCs/>
+          <w:sz w:val="21"/>
+        </w:rPr>
+        <w:t xml:space="preserve">🏆 </w:t>
+      </w:r>
+      <w:r>
+        <w:rPr>
+          <w:rFonts w:hint="eastAsia" w:ascii="宋体" w:hAnsi="宋体" w:eastAsia="宋体"/>
+          <w:b/>
+          <w:bCs/>
+          <w:sz w:val="21"/>
+        </w:rPr>
+        <w:t xml:space="preserve">好习惯打卡</w:t>
+      </w:r>
+      <w:r>
+        <w:rPr>
+          <w:rFonts w:hint="eastAsia" w:ascii="宋体" w:hAnsi="宋体" w:eastAsia="宋体"/>
+          <w:sz w:val="21"/>
+        </w:rPr>
+        <w:t xml:space="preserve">：规范关机整理工位，评定“基础通关</w:t>
+      </w:r>
+      <w:r>
+        <w:rPr>
+          <w:rFonts w:ascii="宋体" w:hAnsi="宋体" w:eastAsia="宋体"/>
+          <w:sz w:val="21"/>
+        </w:rPr>
+        <w:t xml:space="preserve"> / </w:t>
+      </w:r>
+      <w:r>
+        <w:rPr>
+          <w:rFonts w:hint="eastAsia" w:ascii="宋体" w:hAnsi="宋体" w:eastAsia="宋体"/>
+          <w:sz w:val="21"/>
+        </w:rPr>
+        <w:t xml:space="preserve">熟练标兵</w:t>
+      </w:r>
+      <w:r>
+        <w:rPr>
+          <w:rFonts w:ascii="宋体" w:hAnsi="宋体" w:eastAsia="宋体"/>
+          <w:sz w:val="21"/>
+        </w:rPr>
+        <w:t xml:space="preserve"> / </w:t>
+      </w:r>
+      <w:r>
+        <w:rPr>
+          <w:rFonts w:hint="eastAsia" w:ascii="宋体" w:hAnsi="宋体" w:eastAsia="宋体"/>
+          <w:sz w:val="21"/>
+        </w:rPr>
+        <w:t xml:space="preserve">破译小达人”星级。</w:t>
+      </w:r>
+    </w:p>
+    <w:bookmarkEnd w:id="15"/>
+    <w:bookmarkStart w:id="16" w:name="_随堂作业中小学信息科技与人工智能学习平台"/>
+    <w:p>
+      <w:pPr>
+        <w:pStyle w:val="3"/>
+        <w:spacing w:before="120" w:after="60" w:line="312" w:lineRule="auto"/>
+        <w:ind w:firstLine="0"/>
+        <w:jc w:val="left"/>
+      </w:pPr>
+      <w:r>
+        <w:rPr>
+          <w:rFonts w:ascii="黑体" w:hAnsi="黑体" w:eastAsia="黑体"/>
+          <w:b/>
+          <w:color w:val="403070"/>
+          <w:sz w:val="23"/>
+        </w:rPr>
+        <w:t xml:space="preserve">2. </w:t>
+      </w:r>
+      <w:r>
+        <w:rPr>
+          <w:rFonts w:hint="eastAsia" w:ascii="黑体" w:hAnsi="黑体" w:eastAsia="黑体"/>
+          <w:b/>
+          <w:color w:val="403070"/>
+          <w:sz w:val="23"/>
+        </w:rPr>
+        <w:t xml:space="preserve">随堂作业（中小学信息科技与人工智能学习平台）</w:t>
+      </w:r>
+    </w:p>
+    <w:p>
+      <w:pPr>
+        <w:pStyle w:val="Compact"/>
+        <w:numPr>
+          <w:ilvl w:val="0"/>
+          <w:numId w:val="1003"/>
+        </w:numPr>
+        <w:spacing w:before="0" w:after="60" w:line="312" w:lineRule="auto"/>
+        <w:ind w:firstLine="0" w:left="280"/>
+      </w:pPr>
+      <w:r>
+        <w:rPr>
+          <w:rFonts w:hint="eastAsia" w:ascii="宋体" w:hAnsi="宋体" w:eastAsia="宋体"/>
+          <w:sz w:val="21"/>
+        </w:rPr>
+        <w:t xml:space="preserve">在机房本地浏览器双击打开《第10课-课堂作业.html》；</w:t>
+      </w:r>
+    </w:p>
+    <w:p>
+      <w:pPr>
+        <w:pStyle w:val="Compact"/>
+        <w:numPr>
+          <w:ilvl w:val="0"/>
+          <w:numId w:val="1003"/>
+        </w:numPr>
+        <w:spacing w:before="0" w:after="60" w:line="312" w:lineRule="auto"/>
+        <w:ind w:firstLine="0" w:left="280"/>
+      </w:pPr>
+      <w:r>
+        <w:rPr>
+          <w:rFonts w:hint="eastAsia" w:ascii="宋体" w:hAnsi="宋体" w:eastAsia="宋体"/>
+          <w:sz w:val="21"/>
+        </w:rPr>
+        <w:t xml:space="preserve">完成后一键保存并导出</w:t>
+      </w:r>
+      <w:r>
+        <w:rPr>
+          <w:rFonts w:ascii="宋体" w:hAnsi="宋体" w:eastAsia="宋体"/>
+          <w:sz w:val="21"/>
+        </w:rPr>
+        <w:t xml:space="preserve"> </w:t>
+      </w:r>
+      <w:r>
+        <w:rPr>
+          <w:rStyle w:val="VerbatimChar"/>
+          <w:rFonts w:hint="eastAsia" w:ascii="宋体" w:hAnsi="宋体" w:eastAsia="宋体"/>
+          <w:sz w:val="21"/>
+        </w:rPr>
+        <w:t xml:space="preserve">班级_姓名_第10课从数据到编码_得分.txt</w:t>
+      </w:r>
+      <w:r>
+        <w:rPr>
+          <w:rFonts w:hint="eastAsia" w:ascii="宋体" w:hAnsi="宋体" w:eastAsia="宋体"/>
+          <w:sz w:val="21"/>
+        </w:rPr>
+        <w:t xml:space="preserve">，同页面提交。</w:t>
+      </w:r>
+    </w:p>
+    <w:bookmarkEnd w:id="16"/>
+    <w:bookmarkStart w:id="17" w:name="_课后探究"/>
+    <w:p>
+      <w:pPr>
+        <w:pStyle w:val="3"/>
+        <w:spacing w:before="120" w:after="60" w:line="312" w:lineRule="auto"/>
+        <w:ind w:firstLine="0"/>
+        <w:jc w:val="left"/>
+      </w:pPr>
+      <w:r>
+        <w:rPr>
+          <w:rFonts w:ascii="黑体" w:hAnsi="黑体" w:eastAsia="黑体"/>
+          <w:b/>
+          <w:color w:val="403070"/>
+          <w:sz w:val="23"/>
+        </w:rPr>
+        <w:t xml:space="preserve">3. </w:t>
+      </w:r>
+      <w:r>
+        <w:rPr>
+          <w:rFonts w:hint="eastAsia" w:ascii="黑体" w:hAnsi="黑体" w:eastAsia="黑体"/>
+          <w:b/>
+          <w:color w:val="403070"/>
+          <w:sz w:val="23"/>
+        </w:rPr>
+        <w:t xml:space="preserve">课后探究</w:t>
+      </w:r>
+    </w:p>
+    <w:p>
+      <w:pPr>
+        <w:pStyle w:val="Compact"/>
+        <w:numPr>
+          <w:ilvl w:val="0"/>
+          <w:numId w:val="1004"/>
+        </w:numPr>
+        <w:spacing w:before="0" w:after="60" w:line="312" w:lineRule="auto"/>
+        <w:ind w:firstLine="0" w:left="280"/>
+      </w:pPr>
+      <w:r>
+        <w:rPr>
+          <w:rFonts w:hint="eastAsia" w:ascii="宋体" w:hAnsi="宋体" w:eastAsia="宋体"/>
+          <w:sz w:val="21"/>
+        </w:rPr>
+        <w:t xml:space="preserve">课后在家长陪同下观察超市同一品牌不同商品的条形码，记录厂商代码和商品代码，想一想它们有什么相同和不同。</w:t>
+      </w:r>
+    </w:p>
+    <w:bookmarkEnd w:id="17"/>
+    <w:bookmarkEnd w:id="18"/>
+    <w:bookmarkStart w:id="19" w:name="_八教学反思"/>
+    <w:p>
+      <w:pPr>
+        <w:pStyle w:val="2"/>
+        <w:spacing w:before="200" w:after="80" w:line="312" w:lineRule="auto"/>
+        <w:ind w:firstLine="0"/>
+        <w:jc w:val="left"/>
+      </w:pPr>
+      <w:r>
+        <w:rPr>
+          <w:rFonts w:hint="eastAsia" w:ascii="黑体" w:hAnsi="黑体" w:eastAsia="黑体"/>
+          <w:b/>
+          <w:color w:val="2E1F5E"/>
+          <w:sz w:val="26"/>
+        </w:rPr>
+        <w:t xml:space="preserve">八、教学反思</w:t>
+      </w:r>
+    </w:p>
+    <w:p>
+      <w:pPr>
+        <w:pStyle w:val="FirstParagraph"/>
+        <w:spacing w:before="0" w:after="80" w:line="331" w:lineRule="auto"/>
+        <w:ind w:firstLine="440" w:left="0"/>
+      </w:pPr>
+      <w:r>
+        <w:rPr>
+          <w:rFonts w:hint="eastAsia" w:ascii="宋体" w:hAnsi="宋体" w:eastAsia="宋体"/>
+          <w:i/>
+          <w:iCs/>
+          <w:sz w:val="22"/>
+        </w:rPr>
+        <w:t xml:space="preserve">(课后对照以下问题反思)</w:t>
+      </w:r>
+      <w:r>
+        <w:rPr>
+          <w:rFonts w:ascii="宋体" w:hAnsi="宋体" w:eastAsia="宋体"/>
+          <w:sz w:val="22"/>
+        </w:rPr>
+        <w:t xml:space="preserve"> </w:t>
+      </w:r>
+      <w:r>
+        <w:rPr>
+          <w:rFonts w:ascii="宋体" w:hAnsi="宋体" w:eastAsia="宋体"/>
+          <w:sz w:val="22"/>
+        </w:rPr>
+        <w:t xml:space="preserve">-</w:t>
+      </w:r>
+      <w:r>
+        <w:rPr>
+          <w:rFonts w:ascii="宋体" w:hAnsi="宋体" w:eastAsia="宋体"/>
+          <w:sz w:val="22"/>
+        </w:rPr>
+        <w:t xml:space="preserve"> </w:t>
+      </w:r>
+      <w:r>
+        <w:rPr>
+          <w:rFonts w:hint="eastAsia" w:ascii="宋体" w:hAnsi="宋体" w:eastAsia="宋体"/>
+          <w:b/>
+          <w:bCs/>
+          <w:sz w:val="22"/>
+        </w:rPr>
+        <w:t xml:space="preserve">关于认知坡度</w:t>
+      </w:r>
+      <w:r>
+        <w:rPr>
+          <w:rFonts w:hint="eastAsia" w:ascii="宋体" w:hAnsi="宋体" w:eastAsia="宋体"/>
+          <w:sz w:val="22"/>
+        </w:rPr>
+        <w:t xml:space="preserve">：“积木与卡扣”的比喻，学生能否理解“散乱数据通过规则生成唯一标识”？</w:t>
+      </w:r>
+      <w:r>
+        <w:rPr>
+          <w:rFonts w:ascii="宋体" w:hAnsi="宋体" w:eastAsia="宋体"/>
+          <w:sz w:val="22"/>
+        </w:rPr>
+        <w:br/>
+      </w:r>
+      <w:r>
+        <w:rPr>
+          <w:rFonts w:ascii="宋体" w:hAnsi="宋体" w:eastAsia="宋体"/>
+          <w:sz w:val="22"/>
+        </w:rPr>
+        <w:t xml:space="preserve">____________________________________________________________________________________________</w:t>
+      </w:r>
+      <w:r>
+        <w:rPr>
+          <w:rFonts w:ascii="宋体" w:hAnsi="宋体" w:eastAsia="宋体"/>
+          <w:sz w:val="22"/>
+        </w:rPr>
+        <w:t xml:space="preserve"> </w:t>
+      </w:r>
+      <w:r>
+        <w:rPr>
+          <w:rFonts w:ascii="宋体" w:hAnsi="宋体" w:eastAsia="宋体"/>
+          <w:sz w:val="22"/>
+        </w:rPr>
+        <w:t xml:space="preserve">-</w:t>
+      </w:r>
+      <w:r>
+        <w:rPr>
+          <w:rFonts w:ascii="宋体" w:hAnsi="宋体" w:eastAsia="宋体"/>
+          <w:sz w:val="22"/>
+        </w:rPr>
+        <w:t xml:space="preserve"> </w:t>
+      </w:r>
+      <w:r>
+        <w:rPr>
+          <w:rFonts w:hint="eastAsia" w:ascii="宋体" w:hAnsi="宋体" w:eastAsia="宋体"/>
+          <w:b/>
+          <w:bCs/>
+          <w:sz w:val="22"/>
+        </w:rPr>
+        <w:t xml:space="preserve">关于实操卡点</w:t>
+      </w:r>
+      <w:r>
+        <w:rPr>
+          <w:rFonts w:hint="eastAsia" w:ascii="宋体" w:hAnsi="宋体" w:eastAsia="宋体"/>
+          <w:sz w:val="22"/>
+        </w:rPr>
+        <w:t xml:space="preserve">：学生在车门混合编码破译中，“A为左扇、B为右扇”的混淆率是多少？</w:t>
+      </w:r>
+      <w:r>
+        <w:rPr>
+          <w:rFonts w:ascii="宋体" w:hAnsi="宋体" w:eastAsia="宋体"/>
+          <w:sz w:val="22"/>
+        </w:rPr>
+        <w:br/>
+      </w:r>
+      <w:r>
+        <w:rPr>
+          <w:rFonts w:ascii="宋体" w:hAnsi="宋体" w:eastAsia="宋体"/>
+          <w:sz w:val="22"/>
+        </w:rPr>
+        <w:t xml:space="preserve">____________________________________________________________________________________________</w:t>
+      </w:r>
+      <w:r>
+        <w:rPr>
+          <w:rFonts w:ascii="宋体" w:hAnsi="宋体" w:eastAsia="宋体"/>
+          <w:sz w:val="22"/>
+        </w:rPr>
+        <w:t xml:space="preserve"> </w:t>
+      </w:r>
+      <w:r>
+        <w:rPr>
+          <w:rFonts w:ascii="宋体" w:hAnsi="宋体" w:eastAsia="宋体"/>
+          <w:sz w:val="22"/>
+        </w:rPr>
+        <w:t xml:space="preserve">-</w:t>
+      </w:r>
+      <w:r>
+        <w:rPr>
+          <w:rFonts w:ascii="宋体" w:hAnsi="宋体" w:eastAsia="宋体"/>
+          <w:sz w:val="22"/>
+        </w:rPr>
+        <w:t xml:space="preserve"> </w:t>
+      </w:r>
+      <w:r>
+        <w:rPr>
+          <w:rFonts w:hint="eastAsia" w:ascii="宋体" w:hAnsi="宋体" w:eastAsia="宋体"/>
+          <w:b/>
+          <w:bCs/>
+          <w:sz w:val="22"/>
+        </w:rPr>
+        <w:t xml:space="preserve">关于机房常规</w:t>
+      </w:r>
+      <w:r>
+        <w:rPr>
+          <w:rFonts w:hint="eastAsia" w:ascii="宋体" w:hAnsi="宋体" w:eastAsia="宋体"/>
+          <w:sz w:val="22"/>
+        </w:rPr>
+        <w:t xml:space="preserve">：下课时规范关机率和工位复位率是否达到</w:t>
+      </w:r>
+      <w:r>
+        <w:rPr>
+          <w:rFonts w:ascii="宋体" w:hAnsi="宋体" w:eastAsia="宋体"/>
+          <w:sz w:val="22"/>
+        </w:rPr>
+        <w:t xml:space="preserve"> </w:t>
+      </w:r>
+      <w:r>
+        <w:rPr>
+          <w:rFonts w:hint="eastAsia" w:ascii="宋体" w:hAnsi="宋体" w:eastAsia="宋体"/>
+          <w:sz w:val="22"/>
+        </w:rPr>
+        <w:t xml:space="preserve">100%？</w:t>
+      </w:r>
+      <w:r>
+        <w:rPr>
+          <w:rFonts w:ascii="宋体" w:hAnsi="宋体" w:eastAsia="宋体"/>
+          <w:sz w:val="22"/>
+        </w:rPr>
+        <w:br/>
+      </w:r>
+      <w:r>
+        <w:rPr>
+          <w:rFonts w:ascii="宋体" w:hAnsi="宋体" w:eastAsia="宋体"/>
+          <w:sz w:val="22"/>
+        </w:rPr>
+        <w:t xml:space="preserve">____________________________________________________________________________________________</w:t>
+      </w:r>
+    </w:p>
+    <w:bookmarkEnd w:id="19"/>
+    <w:bookmarkEnd w:id="20"/>
     <w:sectPr>
       <w:footnotePr>
         <w:numRestart w:val="eachSect"/>
@@ -3524,11 +3332,126 @@
       </w:pPr>
     </w:lvl>
   </w:abstractNum>
+  <w:abstractNum w:abstractNumId="991">
+    <w:nsid w:val="0000A991"/>
+    <w:multiLevelType w:val="multilevel"/>
+    <w:lvl w:ilvl="0">
+      <w:numFmt w:val="bullet"/>
+      <w:lvlText w:val=""/>
+      <w:lvlJc w:val="left"/>
+      <w:pPr>
+        <w:ind w:left="720" w:hanging="360"/>
+      </w:pPr>
+      <w:rPr>
+        <w:rFonts w:ascii="Symbol" w:hAnsi="Symbol" w:cs="Symbol" w:hint="default"/>
+      </w:rPr>
+    </w:lvl>
+    <w:lvl w:ilvl="1">
+      <w:numFmt w:val="bullet"/>
+      <w:lvlText w:val="o"/>
+      <w:lvlJc w:val="left"/>
+      <w:pPr>
+        <w:ind w:left="1440" w:hanging="360"/>
+      </w:pPr>
+      <w:rPr>
+        <w:rFonts w:ascii="Courier New" w:hAnsi="Courier New" w:cs="Courier New" w:hint="default"/>
+      </w:rPr>
+    </w:lvl>
+    <w:lvl w:ilvl="2">
+      <w:numFmt w:val="bullet"/>
+      <w:lvlText w:val=""/>
+      <w:lvlJc w:val="left"/>
+      <w:pPr>
+        <w:ind w:left="2160" w:hanging="360"/>
+      </w:pPr>
+      <w:rPr>
+        <w:rFonts w:ascii="Wingdings" w:hAnsi="Wingdings" w:cs="Wingdings" w:hint="default"/>
+      </w:rPr>
+    </w:lvl>
+    <w:lvl w:ilvl="3">
+      <w:numFmt w:val="bullet"/>
+      <w:lvlText w:val=""/>
+      <w:lvlJc w:val="left"/>
+      <w:pPr>
+        <w:ind w:left="2880" w:hanging="360"/>
+      </w:pPr>
+      <w:rPr>
+        <w:rFonts w:ascii="Symbol" w:hAnsi="Symbol" w:cs="Symbol" w:hint="default"/>
+      </w:rPr>
+    </w:lvl>
+    <w:lvl w:ilvl="4">
+      <w:numFmt w:val="bullet"/>
+      <w:lvlText w:val="o"/>
+      <w:lvlJc w:val="left"/>
+      <w:pPr>
+        <w:ind w:left="3600" w:hanging="360"/>
+      </w:pPr>
+      <w:rPr>
+        <w:rFonts w:ascii="Courier New" w:hAnsi="Courier New" w:cs="Courier New" w:hint="default"/>
+      </w:rPr>
+    </w:lvl>
+    <w:lvl w:ilvl="5">
+      <w:numFmt w:val="bullet"/>
+      <w:lvlText w:val=""/>
+      <w:lvlJc w:val="left"/>
+      <w:pPr>
+        <w:ind w:left="4320" w:hanging="360"/>
+      </w:pPr>
+      <w:rPr>
+        <w:rFonts w:ascii="Wingdings" w:hAnsi="Wingdings" w:cs="Wingdings" w:hint="default"/>
+      </w:rPr>
+    </w:lvl>
+    <w:lvl w:ilvl="6">
+      <w:numFmt w:val="bullet"/>
+      <w:lvlText w:val=""/>
+      <w:lvlJc w:val="left"/>
+      <w:pPr>
+        <w:ind w:left="5040" w:hanging="360"/>
+      </w:pPr>
+      <w:rPr>
+        <w:rFonts w:ascii="Symbol" w:hAnsi="Symbol" w:cs="Symbol" w:hint="default"/>
+      </w:rPr>
+    </w:lvl>
+    <w:lvl w:ilvl="7">
+      <w:numFmt w:val="bullet"/>
+      <w:lvlText w:val="o"/>
+      <w:lvlJc w:val="left"/>
+      <w:pPr>
+        <w:ind w:left="5760" w:hanging="360"/>
+      </w:pPr>
+      <w:rPr>
+        <w:rFonts w:ascii="Courier New" w:hAnsi="Courier New" w:cs="Courier New" w:hint="default"/>
+      </w:rPr>
+    </w:lvl>
+    <w:lvl w:ilvl="8">
+      <w:numFmt w:val="bullet"/>
+      <w:lvlText w:val=""/>
+      <w:lvlJc w:val="left"/>
+      <w:pPr>
+        <w:ind w:left="6480" w:hanging="360"/>
+      </w:pPr>
+      <w:rPr>
+        <w:rFonts w:ascii="Wingdings" w:hAnsi="Wingdings" w:cs="Wingdings" w:hint="default"/>
+      </w:rPr>
+    </w:lvl>
+  </w:abstractNum>
   <w:num w16cid:durableId="1844859319" w:numId="1">
     <w:abstractNumId w:val="0"/>
   </w:num>
   <w:num w:numId="1000">
     <w:abstractNumId w:val="990"/>
+  </w:num>
+  <w:num w:numId="1001">
+    <w:abstractNumId w:val="991"/>
+  </w:num>
+  <w:num w:numId="1002">
+    <w:abstractNumId w:val="991"/>
+  </w:num>
+  <w:num w:numId="1003">
+    <w:abstractNumId w:val="991"/>
+  </w:num>
+  <w:num w:numId="1004">
+    <w:abstractNumId w:val="991"/>
   </w:num>
 </w:numbering>
 </file>

</xml_diff>